<commit_message>
Documento: el motor, el estado del arte y las habilidades; regresión con el motor estandarizado
Co-Authored-By: Claude Opus 5.5 <noreply@anthropic.com>
Claude-Session: https://claude.ai/code/session_01VY3w9XmL1TrbHxLtQe81Lv
</commit_message>
<xml_diff>
--- a/docs/hitos-y-grafos.docx
+++ b/docs/hitos-y-grafos.docx
@@ -33,7 +33,7 @@
           <w:sz w:val="26"/>
           <w:szCs w:val="26"/>
         </w:rPr>
-        <w:t xml:space="preserve">Las cadenas del libro, los caminos y sus hitos, explicados con dibujos</w:t>
+        <w:t xml:space="preserve">El motor, las cadenas del libro y las habilidades, explicados con dibujos</w:t>
       </w:r>
     </w:p>
     <w:p>
@@ -41,7 +41,7 @@
         <w:pStyle w:val="Heading1"/>
       </w:pPr>
       <w:r>
-        <w:t xml:space="preserve">1. Tres piezas</w:t>
+        <w:t xml:space="preserve">1. El motor</w:t>
       </w:r>
     </w:p>
     <w:p>
@@ -49,17 +49,17 @@
         <w:spacing w:after="120"/>
       </w:pPr>
       <w:r>
-        <w:t xml:space="preserve">En el juego casi nada pasa suelto: como en el libro, una cosa abre la siguiente. Eso se arma con </w:t>
+        <w:t xml:space="preserve">Todo lo que pasa en Avonlea sale de </w:t>
       </w:r>
       <w:r>
         <w:rPr>
           <w:b/>
           <w:bCs/>
         </w:rPr>
-        <w:t xml:space="preserve">tres archivos de texto</w:t>
-      </w:r>
-      <w:r>
-        <w:t xml:space="preserve">, que se pueden leer y escribir sin tocar el código:</w:t>
+        <w:t xml:space="preserve">tres componentes</w:t>
+      </w:r>
+      <w:r>
+        <w:t xml:space="preserve">, y cada uno sigue un modelo conocido de la narrativa interactiva (sección 6):</w:t>
       </w:r>
     </w:p>
     <w:p>
@@ -76,56 +76,40 @@
           <w:b/>
           <w:bCs/>
         </w:rPr>
-        <w:t xml:space="preserve">El guion</w:t>
-      </w:r>
-      <w:r>
-        <w:t xml:space="preserve"> (</w:t>
-      </w:r>
-      <w:r>
-        <w:rPr>
-          <w:rFonts w:ascii="Consolas" w:cs="Consolas" w:eastAsia="Consolas" w:hAnsi="Consolas"/>
-          <w:color w:val="7A4A1A"/>
-          <w:sz w:val="19"/>
-          <w:szCs w:val="19"/>
-        </w:rPr>
-        <w:t xml:space="preserve">src/datos/guion.txt</w:t>
-      </w:r>
-      <w:r>
-        <w:t xml:space="preserve">): escenas que pasan una vez, en un lugar y cuando se cumplen sus condiciones. Al terminar, dejan </w:t>
+        <w:t xml:space="preserve">El estado</w:t>
+      </w:r>
+      <w:r>
+        <w:t xml:space="preserve">: lo que es cierto del mundo. </w:t>
       </w:r>
       <w:r>
         <w:rPr>
           <w:b/>
           <w:bCs/>
         </w:rPr>
-        <w:t xml:space="preserve">hechos</w:t>
-      </w:r>
-      <w:r>
-        <w:t xml:space="preserve"> (por ejemplo </w:t>
-      </w:r>
-      <w:r>
-        <w:rPr>
-          <w:rFonts w:ascii="Consolas" w:cs="Consolas" w:eastAsia="Consolas" w:hAnsi="Consolas"/>
-          <w:color w:val="7A4A1A"/>
-          <w:sz w:val="19"/>
-          <w:szCs w:val="19"/>
-        </w:rPr>
-        <w:t xml:space="preserve">conocidas_diana</w:t>
-      </w:r>
-      <w:r>
-        <w:t xml:space="preserve"> o </w:t>
-      </w:r>
-      <w:r>
-        <w:rPr>
-          <w:rFonts w:ascii="Consolas" w:cs="Consolas" w:eastAsia="Consolas" w:hAnsi="Consolas"/>
-          <w:color w:val="7A4A1A"/>
-          <w:sz w:val="19"/>
-          <w:szCs w:val="19"/>
-        </w:rPr>
-        <w:t xml:space="preserve">prohibida</w:t>
-      </w:r>
-      <w:r>
-        <w:t xml:space="preserve">).</w:t>
+        <w:t xml:space="preserve">Hechos</w:t>
+      </w:r>
+      <w:r>
+        <w:t xml:space="preserve"> (algo que pasó, con el día; o algo que alguien sabe), </w:t>
+      </w:r>
+      <w:r>
+        <w:rPr>
+          <w:b/>
+          <w:bCs/>
+        </w:rPr>
+        <w:t xml:space="preserve">cualidades</w:t>
+      </w:r>
+      <w:r>
+        <w:t xml:space="preserve"> (números con dueño: la granja de Ana, el estudio de Gilbert, el afecto de Diana hacia Ana) y el </w:t>
+      </w:r>
+      <w:r>
+        <w:rPr>
+          <w:b/>
+          <w:bCs/>
+        </w:rPr>
+        <w:t xml:space="preserve">tiempo</w:t>
+      </w:r>
+      <w:r>
+        <w:t xml:space="preserve"> (hora, día, estación).</w:t>
       </w:r>
     </w:p>
     <w:p>
@@ -142,7 +126,7 @@
           <w:b/>
           <w:bCs/>
         </w:rPr>
-        <w:t xml:space="preserve">El cuaderno</w:t>
+        <w:t xml:space="preserve">Las escenas</w:t>
       </w:r>
       <w:r>
         <w:t xml:space="preserve"> (</w:t>
@@ -154,20 +138,40 @@
           <w:sz w:val="19"/>
           <w:szCs w:val="19"/>
         </w:rPr>
-        <w:t xml:space="preserve">src/datos/cuaderno.txt</w:t>
-      </w:r>
-      <w:r>
-        <w:t xml:space="preserve">): las metas que el jugador ve (📖), con pistas. Una meta puede </w:t>
+        <w:t xml:space="preserve">src/datos/guion.txt</w:t>
+      </w:r>
+      <w:r>
+        <w:t xml:space="preserve">): piezas de historia con </w:t>
       </w:r>
       <w:r>
         <w:rPr>
           <w:b/>
           <w:bCs/>
         </w:rPr>
-        <w:t xml:space="preserve">requerir</w:t>
-      </w:r>
-      <w:r>
-        <w:t xml:space="preserve"> hechos u otras metas; mientras está cerrada (🔒), lo suyo no se puede hacer.</w:t>
+        <w:t xml:space="preserve">precondiciones</w:t>
+      </w:r>
+      <w:r>
+        <w:t xml:space="preserve"> (dónde, quiénes, qué tiene que ser cierto), </w:t>
+      </w:r>
+      <w:r>
+        <w:rPr>
+          <w:b/>
+          <w:bCs/>
+        </w:rPr>
+        <w:t xml:space="preserve">contenido</w:t>
+      </w:r>
+      <w:r>
+        <w:t xml:space="preserve"> (el diálogo) y </w:t>
+      </w:r>
+      <w:r>
+        <w:rPr>
+          <w:b/>
+          <w:bCs/>
+        </w:rPr>
+        <w:t xml:space="preserve">efectos</w:t>
+      </w:r>
+      <w:r>
+        <w:t xml:space="preserve"> (dejan hechos, suman a cualidades, le encargan una meta a alguien). Las rutinas son escenas que se repiten.</w:t>
       </w:r>
     </w:p>
     <w:p>
@@ -184,10 +188,25 @@
           <w:b/>
           <w:bCs/>
         </w:rPr>
-        <w:t xml:space="preserve">Los caminos</w:t>
-      </w:r>
-      <w:r>
-        <w:t xml:space="preserve"> (</w:t>
+        <w:t xml:space="preserve">El planificador</w:t>
+      </w:r>
+      <w:r>
+        <w:t xml:space="preserve">: el «cómo». Cuando una escena le encarga una meta a un personaje («Ana está en La Cuesta del Huerto»), busca con A* las acciones para cumplirla. Las acciones de cualquier personaje también cambian el estado.</w:t>
+      </w:r>
+    </w:p>
+    <w:p>
+      <w:pPr>
+        <w:spacing w:after="120"/>
+      </w:pPr>
+      <w:r>
+        <w:rPr>
+          <w:b/>
+          <w:bCs/>
+        </w:rPr>
+        <w:t xml:space="preserve">El cuaderno</w:t>
+      </w:r>
+      <w:r>
+        <w:t xml:space="preserve"> (📖, </w:t>
       </w:r>
       <w:r>
         <w:rPr>
@@ -196,20 +215,10 @@
           <w:sz w:val="19"/>
           <w:szCs w:val="19"/>
         </w:rPr>
-        <w:t xml:space="preserve">src/datos/caminos.txt</w:t>
-      </w:r>
-      <w:r>
-        <w:t xml:space="preserve">): números que suben día a día con lo que Ana hace; al cruzar un </w:t>
-      </w:r>
-      <w:r>
-        <w:rPr>
-          <w:b/>
-          <w:bCs/>
-        </w:rPr>
-        <w:t xml:space="preserve">hito</w:t>
-      </w:r>
-      <w:r>
-        <w:t xml:space="preserve">, alguien se lo dice.</w:t>
+        <w:t xml:space="preserve">src/datos/cuaderno.txt</w:t>
+      </w:r>
+      <w:r>
+        <w:t xml:space="preserve">) no es parte del motor: lee el estado y le muestra al jugador las metas, con pistas, para que se guíe.</w:t>
       </w:r>
     </w:p>
     <w:p>
@@ -220,7 +229,7 @@
       <w:r>
         <w:drawing>
           <wp:inline distT="0" distB="0" distL="0" distR="0">
-            <wp:extent cx="5715000" cy="1590675"/>
+            <wp:extent cx="6096000" cy="1914525"/>
             <wp:effectExtent t="0" r="0" b="0" l="0"/>
             <wp:docPr id="1" name="" descr="" title=""/>
             <wp:cNvGraphicFramePr>
@@ -245,7 +254,7 @@
                   <pic:spPr bwMode="auto">
                     <a:xfrm>
                       <a:off x="0" y="0"/>
-                      <a:ext cx="5715000" cy="1590675"/>
+                      <a:ext cx="6096000" cy="1914525"/>
                     </a:xfrm>
                     <a:prstGeom prst="rect">
                       <a:avLst/>
@@ -271,9 +280,745 @@
           <w:sz w:val="18"/>
           <w:szCs w:val="18"/>
         </w:rPr>
-        <w:t xml:space="preserve">Figura 1. Las tres piezas y cómo se conectan: los hechos del guion y los números de los caminos abren las metas del cuaderno; las escenas también pueden esperar un camino.</w:t>
-      </w:r>
-    </w:p>
+        <w:t xml:space="preserve">Figura 1. El motor: el estado, las escenas que lo leen y lo cambian, y el planificador que cumple lo que las escenas encargan.</w:t>
+      </w:r>
+    </w:p>
+    <w:tbl>
+      <w:tblPr>
+        <w:tblW w:type="dxa" w:w="9026"/>
+        <w:tblBorders>
+          <w:top w:val="single" w:color="auto" w:sz="4"/>
+          <w:left w:val="single" w:color="auto" w:sz="4"/>
+          <w:bottom w:val="single" w:color="auto" w:sz="4"/>
+          <w:right w:val="single" w:color="auto" w:sz="4"/>
+          <w:insideH w:val="single" w:color="auto" w:sz="4"/>
+          <w:insideV w:val="single" w:color="auto" w:sz="4"/>
+        </w:tblBorders>
+      </w:tblPr>
+      <w:tblGrid>
+        <w:gridCol w:w="3610"/>
+        <w:gridCol w:w="5416"/>
+      </w:tblGrid>
+      <w:tr>
+        <w:trPr>
+          <w:tblHeader/>
+        </w:trPr>
+        <w:tc>
+          <w:tcPr>
+            <w:tcW w:type="dxa" w:w="3610"/>
+            <w:tcBorders>
+              <w:top w:val="single" w:color="B8B0A0" w:sz="4"/>
+              <w:left w:val="single" w:color="B8B0A0" w:sz="4"/>
+              <w:bottom w:val="single" w:color="B8B0A0" w:sz="4"/>
+              <w:right w:val="single" w:color="B8B0A0" w:sz="4"/>
+            </w:tcBorders>
+            <w:shd w:fill="E8E0CC" w:val="clear"/>
+            <w:tcMar>
+              <w:top w:type="dxa" w:w="60"/>
+              <w:left w:type="dxa" w:w="100"/>
+              <w:bottom w:type="dxa" w:w="60"/>
+              <w:right w:type="dxa" w:w="100"/>
+            </w:tcMar>
+          </w:tcPr>
+          <w:p>
+            <w:r>
+              <w:rPr>
+                <w:b/>
+                <w:bCs/>
+                <w:sz w:val="19"/>
+                <w:szCs w:val="19"/>
+              </w:rPr>
+              <w:t xml:space="preserve">Se escribe</w:t>
+            </w:r>
+          </w:p>
+        </w:tc>
+        <w:tc>
+          <w:tcPr>
+            <w:tcW w:type="dxa" w:w="5416"/>
+            <w:tcBorders>
+              <w:top w:val="single" w:color="B8B0A0" w:sz="4"/>
+              <w:left w:val="single" w:color="B8B0A0" w:sz="4"/>
+              <w:bottom w:val="single" w:color="B8B0A0" w:sz="4"/>
+              <w:right w:val="single" w:color="B8B0A0" w:sz="4"/>
+            </w:tcBorders>
+            <w:shd w:fill="E8E0CC" w:val="clear"/>
+            <w:tcMar>
+              <w:top w:type="dxa" w:w="60"/>
+              <w:left w:type="dxa" w:w="100"/>
+              <w:bottom w:type="dxa" w:w="60"/>
+              <w:right w:type="dxa" w:w="100"/>
+            </w:tcMar>
+          </w:tcPr>
+          <w:p>
+            <w:r>
+              <w:rPr>
+                <w:b/>
+                <w:bCs/>
+                <w:sz w:val="19"/>
+                <w:szCs w:val="19"/>
+              </w:rPr>
+              <w:t xml:space="preserve">Significa</w:t>
+            </w:r>
+          </w:p>
+        </w:tc>
+      </w:tr>
+      <w:tr>
+        <w:tc>
+          <w:tcPr>
+            <w:tcW w:type="dxa" w:w="3610"/>
+            <w:tcBorders>
+              <w:top w:val="single" w:color="B8B0A0" w:sz="4"/>
+              <w:left w:val="single" w:color="B8B0A0" w:sz="4"/>
+              <w:bottom w:val="single" w:color="B8B0A0" w:sz="4"/>
+              <w:right w:val="single" w:color="B8B0A0" w:sz="4"/>
+            </w:tcBorders>
+            <w:tcMar>
+              <w:top w:type="dxa" w:w="60"/>
+              <w:left w:type="dxa" w:w="100"/>
+              <w:bottom w:type="dxa" w:w="60"/>
+              <w:right w:type="dxa" w:w="100"/>
+            </w:tcMar>
+          </w:tcPr>
+          <w:p>
+            <w:r>
+              <w:rPr>
+                <w:rFonts w:ascii="Consolas" w:cs="Consolas" w:eastAsia="Consolas" w:hAnsi="Consolas"/>
+                <w:color w:val="7A4A1A"/>
+                <w:sz w:val="19"/>
+                <w:szCs w:val="19"/>
+              </w:rPr>
+              <w:t xml:space="preserve">hecho:prohibida</w:t>
+            </w:r>
+            <w:r>
+              <w:rPr>
+                <w:sz w:val="19"/>
+                <w:szCs w:val="19"/>
+              </w:rPr>
+              <w:t xml:space="preserve">, </w:t>
+            </w:r>
+            <w:r>
+              <w:rPr>
+                <w:rFonts w:ascii="Consolas" w:cs="Consolas" w:eastAsia="Consolas" w:hAnsi="Consolas"/>
+                <w:color w:val="7A4A1A"/>
+                <w:sz w:val="19"/>
+                <w:szCs w:val="19"/>
+              </w:rPr>
+              <w:t xml:space="preserve">!hecho:crup</w:t>
+            </w:r>
+          </w:p>
+        </w:tc>
+        <w:tc>
+          <w:tcPr>
+            <w:tcW w:type="dxa" w:w="5416"/>
+            <w:tcBorders>
+              <w:top w:val="single" w:color="B8B0A0" w:sz="4"/>
+              <w:left w:val="single" w:color="B8B0A0" w:sz="4"/>
+              <w:bottom w:val="single" w:color="B8B0A0" w:sz="4"/>
+              <w:right w:val="single" w:color="B8B0A0" w:sz="4"/>
+            </w:tcBorders>
+            <w:tcMar>
+              <w:top w:type="dxa" w:w="60"/>
+              <w:left w:type="dxa" w:w="100"/>
+              <w:bottom w:type="dxa" w:w="60"/>
+              <w:right w:type="dxa" w:w="100"/>
+            </w:tcMar>
+          </w:tcPr>
+          <w:p>
+            <w:r>
+              <w:rPr>
+                <w:sz w:val="19"/>
+                <w:szCs w:val="19"/>
+              </w:rPr>
+              <w:t xml:space="preserve">pasó (o no) ese hecho</w:t>
+            </w:r>
+          </w:p>
+        </w:tc>
+      </w:tr>
+      <w:tr>
+        <w:tc>
+          <w:tcPr>
+            <w:tcW w:type="dxa" w:w="3610"/>
+            <w:tcBorders>
+              <w:top w:val="single" w:color="B8B0A0" w:sz="4"/>
+              <w:left w:val="single" w:color="B8B0A0" w:sz="4"/>
+              <w:bottom w:val="single" w:color="B8B0A0" w:sz="4"/>
+              <w:right w:val="single" w:color="B8B0A0" w:sz="4"/>
+            </w:tcBorders>
+            <w:tcMar>
+              <w:top w:type="dxa" w:w="60"/>
+              <w:left w:type="dxa" w:w="100"/>
+              <w:bottom w:type="dxa" w:w="60"/>
+              <w:right w:type="dxa" w:w="100"/>
+            </w:tcMar>
+          </w:tcPr>
+          <w:p>
+            <w:r>
+              <w:rPr>
+                <w:rFonts w:ascii="Consolas" w:cs="Consolas" w:eastAsia="Consolas" w:hAnsi="Consolas"/>
+                <w:color w:val="7A4A1A"/>
+                <w:sz w:val="19"/>
+                <w:szCs w:val="19"/>
+              </w:rPr>
+              <w:t xml:space="preserve">dias_desde:prohibida:2</w:t>
+            </w:r>
+          </w:p>
+        </w:tc>
+        <w:tc>
+          <w:tcPr>
+            <w:tcW w:type="dxa" w:w="5416"/>
+            <w:tcBorders>
+              <w:top w:val="single" w:color="B8B0A0" w:sz="4"/>
+              <w:left w:val="single" w:color="B8B0A0" w:sz="4"/>
+              <w:bottom w:val="single" w:color="B8B0A0" w:sz="4"/>
+              <w:right w:val="single" w:color="B8B0A0" w:sz="4"/>
+            </w:tcBorders>
+            <w:tcMar>
+              <w:top w:type="dxa" w:w="60"/>
+              <w:left w:type="dxa" w:w="100"/>
+              <w:bottom w:type="dxa" w:w="60"/>
+              <w:right w:type="dxa" w:w="100"/>
+            </w:tcMar>
+          </w:tcPr>
+          <w:p>
+            <w:r>
+              <w:rPr>
+                <w:sz w:val="19"/>
+                <w:szCs w:val="19"/>
+              </w:rPr>
+              <w:t xml:space="preserve">pasaron al menos 2 días desde ese hecho</w:t>
+            </w:r>
+          </w:p>
+        </w:tc>
+      </w:tr>
+      <w:tr>
+        <w:tc>
+          <w:tcPr>
+            <w:tcW w:type="dxa" w:w="3610"/>
+            <w:tcBorders>
+              <w:top w:val="single" w:color="B8B0A0" w:sz="4"/>
+              <w:left w:val="single" w:color="B8B0A0" w:sz="4"/>
+              <w:bottom w:val="single" w:color="B8B0A0" w:sz="4"/>
+              <w:right w:val="single" w:color="B8B0A0" w:sz="4"/>
+            </w:tcBorders>
+            <w:tcMar>
+              <w:top w:type="dxa" w:w="60"/>
+              <w:left w:type="dxa" w:w="100"/>
+              <w:bottom w:type="dxa" w:w="60"/>
+              <w:right w:type="dxa" w:w="100"/>
+            </w:tcMar>
+          </w:tcPr>
+          <w:p>
+            <w:r>
+              <w:rPr>
+                <w:rFonts w:ascii="Consolas" w:cs="Consolas" w:eastAsia="Consolas" w:hAnsi="Consolas"/>
+                <w:color w:val="7A4A1A"/>
+                <w:sz w:val="19"/>
+                <w:szCs w:val="19"/>
+              </w:rPr>
+              <w:t xml:space="preserve">sabe:marilla:diana_borracha</w:t>
+            </w:r>
+          </w:p>
+        </w:tc>
+        <w:tc>
+          <w:tcPr>
+            <w:tcW w:type="dxa" w:w="5416"/>
+            <w:tcBorders>
+              <w:top w:val="single" w:color="B8B0A0" w:sz="4"/>
+              <w:left w:val="single" w:color="B8B0A0" w:sz="4"/>
+              <w:bottom w:val="single" w:color="B8B0A0" w:sz="4"/>
+              <w:right w:val="single" w:color="B8B0A0" w:sz="4"/>
+            </w:tcBorders>
+            <w:tcMar>
+              <w:top w:type="dxa" w:w="60"/>
+              <w:left w:type="dxa" w:w="100"/>
+              <w:bottom w:type="dxa" w:w="60"/>
+              <w:right w:type="dxa" w:w="100"/>
+            </w:tcMar>
+          </w:tcPr>
+          <w:p>
+            <w:r>
+              <w:rPr>
+                <w:sz w:val="19"/>
+                <w:szCs w:val="19"/>
+              </w:rPr>
+              <w:t xml:space="preserve">Marilla sabe ese hecho (alguien se lo contó)</w:t>
+            </w:r>
+          </w:p>
+        </w:tc>
+      </w:tr>
+      <w:tr>
+        <w:tc>
+          <w:tcPr>
+            <w:tcW w:type="dxa" w:w="3610"/>
+            <w:tcBorders>
+              <w:top w:val="single" w:color="B8B0A0" w:sz="4"/>
+              <w:left w:val="single" w:color="B8B0A0" w:sz="4"/>
+              <w:bottom w:val="single" w:color="B8B0A0" w:sz="4"/>
+              <w:right w:val="single" w:color="B8B0A0" w:sz="4"/>
+            </w:tcBorders>
+            <w:tcMar>
+              <w:top w:type="dxa" w:w="60"/>
+              <w:left w:type="dxa" w:w="100"/>
+              <w:bottom w:type="dxa" w:w="60"/>
+              <w:right w:type="dxa" w:w="100"/>
+            </w:tcMar>
+          </w:tcPr>
+          <w:p>
+            <w:r>
+              <w:rPr>
+                <w:rFonts w:ascii="Consolas" w:cs="Consolas" w:eastAsia="Consolas" w:hAnsi="Consolas"/>
+                <w:color w:val="7A4A1A"/>
+                <w:sz w:val="19"/>
+                <w:szCs w:val="19"/>
+              </w:rPr>
+              <w:t xml:space="preserve">granja:ana&gt;=15</w:t>
+            </w:r>
+            <w:r>
+              <w:rPr>
+                <w:sz w:val="19"/>
+                <w:szCs w:val="19"/>
+              </w:rPr>
+              <w:t xml:space="preserve">, </w:t>
+            </w:r>
+            <w:r>
+              <w:rPr>
+                <w:rFonts w:ascii="Consolas" w:cs="Consolas" w:eastAsia="Consolas" w:hAnsi="Consolas"/>
+                <w:color w:val="7A4A1A"/>
+                <w:sz w:val="19"/>
+                <w:szCs w:val="19"/>
+              </w:rPr>
+              <w:t xml:space="preserve">estudio:gilbert&lt;30</w:t>
+            </w:r>
+          </w:p>
+        </w:tc>
+        <w:tc>
+          <w:tcPr>
+            <w:tcW w:type="dxa" w:w="5416"/>
+            <w:tcBorders>
+              <w:top w:val="single" w:color="B8B0A0" w:sz="4"/>
+              <w:left w:val="single" w:color="B8B0A0" w:sz="4"/>
+              <w:bottom w:val="single" w:color="B8B0A0" w:sz="4"/>
+              <w:right w:val="single" w:color="B8B0A0" w:sz="4"/>
+            </w:tcBorders>
+            <w:tcMar>
+              <w:top w:type="dxa" w:w="60"/>
+              <w:left w:type="dxa" w:w="100"/>
+              <w:bottom w:type="dxa" w:w="60"/>
+              <w:right w:type="dxa" w:w="100"/>
+            </w:tcMar>
+          </w:tcPr>
+          <w:p>
+            <w:r>
+              <w:rPr>
+                <w:sz w:val="19"/>
+                <w:szCs w:val="19"/>
+              </w:rPr>
+              <w:t xml:space="preserve">una cualidad de alguien, comparada con un número</w:t>
+            </w:r>
+          </w:p>
+        </w:tc>
+      </w:tr>
+      <w:tr>
+        <w:tc>
+          <w:tcPr>
+            <w:tcW w:type="dxa" w:w="3610"/>
+            <w:tcBorders>
+              <w:top w:val="single" w:color="B8B0A0" w:sz="4"/>
+              <w:left w:val="single" w:color="B8B0A0" w:sz="4"/>
+              <w:bottom w:val="single" w:color="B8B0A0" w:sz="4"/>
+              <w:right w:val="single" w:color="B8B0A0" w:sz="4"/>
+            </w:tcBorders>
+            <w:tcMar>
+              <w:top w:type="dxa" w:w="60"/>
+              <w:left w:type="dxa" w:w="100"/>
+              <w:bottom w:type="dxa" w:w="60"/>
+              <w:right w:type="dxa" w:w="100"/>
+            </w:tcMar>
+          </w:tcPr>
+          <w:p>
+            <w:r>
+              <w:rPr>
+                <w:rFonts w:ascii="Consolas" w:cs="Consolas" w:eastAsia="Consolas" w:hAnsi="Consolas"/>
+                <w:color w:val="7A4A1A"/>
+                <w:sz w:val="19"/>
+                <w:szCs w:val="19"/>
+              </w:rPr>
+              <w:t xml:space="preserve">afecto:diana:ana&gt;=4</w:t>
+            </w:r>
+          </w:p>
+        </w:tc>
+        <w:tc>
+          <w:tcPr>
+            <w:tcW w:type="dxa" w:w="5416"/>
+            <w:tcBorders>
+              <w:top w:val="single" w:color="B8B0A0" w:sz="4"/>
+              <w:left w:val="single" w:color="B8B0A0" w:sz="4"/>
+              <w:bottom w:val="single" w:color="B8B0A0" w:sz="4"/>
+              <w:right w:val="single" w:color="B8B0A0" w:sz="4"/>
+            </w:tcBorders>
+            <w:tcMar>
+              <w:top w:type="dxa" w:w="60"/>
+              <w:left w:type="dxa" w:w="100"/>
+              <w:bottom w:type="dxa" w:w="60"/>
+              <w:right w:type="dxa" w:w="100"/>
+            </w:tcMar>
+          </w:tcPr>
+          <w:p>
+            <w:r>
+              <w:rPr>
+                <w:sz w:val="19"/>
+                <w:szCs w:val="19"/>
+              </w:rPr>
+              <w:t xml:space="preserve">el afecto de Diana hacia Ana (de 0 a 5)</w:t>
+            </w:r>
+          </w:p>
+        </w:tc>
+      </w:tr>
+      <w:tr>
+        <w:tc>
+          <w:tcPr>
+            <w:tcW w:type="dxa" w:w="3610"/>
+            <w:tcBorders>
+              <w:top w:val="single" w:color="B8B0A0" w:sz="4"/>
+              <w:left w:val="single" w:color="B8B0A0" w:sz="4"/>
+              <w:bottom w:val="single" w:color="B8B0A0" w:sz="4"/>
+              <w:right w:val="single" w:color="B8B0A0" w:sz="4"/>
+            </w:tcBorders>
+            <w:tcMar>
+              <w:top w:type="dxa" w:w="60"/>
+              <w:left w:type="dxa" w:w="100"/>
+              <w:bottom w:type="dxa" w:w="60"/>
+              <w:right w:type="dxa" w:w="100"/>
+            </w:tcMar>
+          </w:tcPr>
+          <w:p>
+            <w:r>
+              <w:rPr>
+                <w:rFonts w:ascii="Consolas" w:cs="Consolas" w:eastAsia="Consolas" w:hAnsi="Consolas"/>
+                <w:color w:val="7A4A1A"/>
+                <w:sz w:val="19"/>
+                <w:szCs w:val="19"/>
+              </w:rPr>
+              <w:t xml:space="preserve">estacion:verano</w:t>
+            </w:r>
+            <w:r>
+              <w:rPr>
+                <w:sz w:val="19"/>
+                <w:szCs w:val="19"/>
+              </w:rPr>
+              <w:t xml:space="preserve">, </w:t>
+            </w:r>
+            <w:r>
+              <w:rPr>
+                <w:rFonts w:ascii="Consolas" w:cs="Consolas" w:eastAsia="Consolas" w:hAnsi="Consolas"/>
+                <w:color w:val="7A4A1A"/>
+                <w:sz w:val="19"/>
+                <w:szCs w:val="19"/>
+              </w:rPr>
+              <w:t xml:space="preserve">dia_estacion:1</w:t>
+            </w:r>
+          </w:p>
+        </w:tc>
+        <w:tc>
+          <w:tcPr>
+            <w:tcW w:type="dxa" w:w="5416"/>
+            <w:tcBorders>
+              <w:top w:val="single" w:color="B8B0A0" w:sz="4"/>
+              <w:left w:val="single" w:color="B8B0A0" w:sz="4"/>
+              <w:bottom w:val="single" w:color="B8B0A0" w:sz="4"/>
+              <w:right w:val="single" w:color="B8B0A0" w:sz="4"/>
+            </w:tcBorders>
+            <w:tcMar>
+              <w:top w:type="dxa" w:w="60"/>
+              <w:left w:type="dxa" w:w="100"/>
+              <w:bottom w:type="dxa" w:w="60"/>
+              <w:right w:type="dxa" w:w="100"/>
+            </w:tcMar>
+          </w:tcPr>
+          <w:p>
+            <w:r>
+              <w:rPr>
+                <w:sz w:val="19"/>
+                <w:szCs w:val="19"/>
+              </w:rPr>
+              <w:t xml:space="preserve">el tiempo</w:t>
+            </w:r>
+          </w:p>
+        </w:tc>
+      </w:tr>
+      <w:tr>
+        <w:tc>
+          <w:tcPr>
+            <w:tcW w:type="dxa" w:w="3610"/>
+            <w:tcBorders>
+              <w:top w:val="single" w:color="B8B0A0" w:sz="4"/>
+              <w:left w:val="single" w:color="B8B0A0" w:sz="4"/>
+              <w:bottom w:val="single" w:color="B8B0A0" w:sz="4"/>
+              <w:right w:val="single" w:color="B8B0A0" w:sz="4"/>
+            </w:tcBorders>
+            <w:tcMar>
+              <w:top w:type="dxa" w:w="60"/>
+              <w:left w:type="dxa" w:w="100"/>
+              <w:bottom w:type="dxa" w:w="60"/>
+              <w:right w:type="dxa" w:w="100"/>
+            </w:tcMar>
+          </w:tcPr>
+          <w:p>
+            <w:r>
+              <w:rPr>
+                <w:rFonts w:ascii="Consolas" w:cs="Consolas" w:eastAsia="Consolas" w:hAnsi="Consolas"/>
+                <w:color w:val="7A4A1A"/>
+                <w:sz w:val="19"/>
+                <w:szCs w:val="19"/>
+              </w:rPr>
+              <w:t xml:space="preserve">hecho x</w:t>
+            </w:r>
+            <w:r>
+              <w:rPr>
+                <w:sz w:val="19"/>
+                <w:szCs w:val="19"/>
+              </w:rPr>
+              <w:t xml:space="preserve">, </w:t>
+            </w:r>
+            <w:r>
+              <w:rPr>
+                <w:rFonts w:ascii="Consolas" w:cs="Consolas" w:eastAsia="Consolas" w:hAnsi="Consolas"/>
+                <w:color w:val="7A4A1A"/>
+                <w:sz w:val="19"/>
+                <w:szCs w:val="19"/>
+              </w:rPr>
+              <w:t xml:space="preserve">olvidar x</w:t>
+            </w:r>
+            <w:r>
+              <w:rPr>
+                <w:sz w:val="19"/>
+                <w:szCs w:val="19"/>
+              </w:rPr>
+              <w:t xml:space="preserve">, </w:t>
+            </w:r>
+            <w:r>
+              <w:rPr>
+                <w:rFonts w:ascii="Consolas" w:cs="Consolas" w:eastAsia="Consolas" w:hAnsi="Consolas"/>
+                <w:color w:val="7A4A1A"/>
+                <w:sz w:val="19"/>
+                <w:szCs w:val="19"/>
+              </w:rPr>
+              <w:t xml:space="preserve">contar marilla x</w:t>
+            </w:r>
+          </w:p>
+        </w:tc>
+        <w:tc>
+          <w:tcPr>
+            <w:tcW w:type="dxa" w:w="5416"/>
+            <w:tcBorders>
+              <w:top w:val="single" w:color="B8B0A0" w:sz="4"/>
+              <w:left w:val="single" w:color="B8B0A0" w:sz="4"/>
+              <w:bottom w:val="single" w:color="B8B0A0" w:sz="4"/>
+              <w:right w:val="single" w:color="B8B0A0" w:sz="4"/>
+            </w:tcBorders>
+            <w:tcMar>
+              <w:top w:type="dxa" w:w="60"/>
+              <w:left w:type="dxa" w:w="100"/>
+              <w:bottom w:type="dxa" w:w="60"/>
+              <w:right w:type="dxa" w:w="100"/>
+            </w:tcMar>
+          </w:tcPr>
+          <w:p>
+            <w:r>
+              <w:rPr>
+                <w:sz w:val="19"/>
+                <w:szCs w:val="19"/>
+              </w:rPr>
+              <w:t xml:space="preserve">efectos sobre los hechos</w:t>
+            </w:r>
+          </w:p>
+        </w:tc>
+      </w:tr>
+      <w:tr>
+        <w:tc>
+          <w:tcPr>
+            <w:tcW w:type="dxa" w:w="3610"/>
+            <w:tcBorders>
+              <w:top w:val="single" w:color="B8B0A0" w:sz="4"/>
+              <w:left w:val="single" w:color="B8B0A0" w:sz="4"/>
+              <w:bottom w:val="single" w:color="B8B0A0" w:sz="4"/>
+              <w:right w:val="single" w:color="B8B0A0" w:sz="4"/>
+            </w:tcBorders>
+            <w:tcMar>
+              <w:top w:type="dxa" w:w="60"/>
+              <w:left w:type="dxa" w:w="100"/>
+              <w:bottom w:type="dxa" w:w="60"/>
+              <w:right w:type="dxa" w:w="100"/>
+            </w:tcMar>
+          </w:tcPr>
+          <w:p>
+            <w:r>
+              <w:rPr>
+                <w:rFonts w:ascii="Consolas" w:cs="Consolas" w:eastAsia="Consolas" w:hAnsi="Consolas"/>
+                <w:color w:val="7A4A1A"/>
+                <w:sz w:val="19"/>
+                <w:szCs w:val="19"/>
+              </w:rPr>
+              <w:t xml:space="preserve">suma granja:ana 2</w:t>
+            </w:r>
+            <w:r>
+              <w:rPr>
+                <w:sz w:val="19"/>
+                <w:szCs w:val="19"/>
+              </w:rPr>
+              <w:t xml:space="preserve">, </w:t>
+            </w:r>
+            <w:r>
+              <w:rPr>
+                <w:rFonts w:ascii="Consolas" w:cs="Consolas" w:eastAsia="Consolas" w:hAnsi="Consolas"/>
+                <w:color w:val="7A4A1A"/>
+                <w:sz w:val="19"/>
+                <w:szCs w:val="19"/>
+              </w:rPr>
+              <w:t xml:space="preserve">suma afecto:diana:ana -1</w:t>
+            </w:r>
+          </w:p>
+        </w:tc>
+        <w:tc>
+          <w:tcPr>
+            <w:tcW w:type="dxa" w:w="5416"/>
+            <w:tcBorders>
+              <w:top w:val="single" w:color="B8B0A0" w:sz="4"/>
+              <w:left w:val="single" w:color="B8B0A0" w:sz="4"/>
+              <w:bottom w:val="single" w:color="B8B0A0" w:sz="4"/>
+              <w:right w:val="single" w:color="B8B0A0" w:sz="4"/>
+            </w:tcBorders>
+            <w:tcMar>
+              <w:top w:type="dxa" w:w="60"/>
+              <w:left w:type="dxa" w:w="100"/>
+              <w:bottom w:type="dxa" w:w="60"/>
+              <w:right w:type="dxa" w:w="100"/>
+            </w:tcMar>
+          </w:tcPr>
+          <w:p>
+            <w:r>
+              <w:rPr>
+                <w:sz w:val="19"/>
+                <w:szCs w:val="19"/>
+              </w:rPr>
+              <w:t xml:space="preserve">efectos sobre las cualidades</w:t>
+            </w:r>
+          </w:p>
+        </w:tc>
+      </w:tr>
+      <w:tr>
+        <w:tc>
+          <w:tcPr>
+            <w:tcW w:type="dxa" w:w="3610"/>
+            <w:tcBorders>
+              <w:top w:val="single" w:color="B8B0A0" w:sz="4"/>
+              <w:left w:val="single" w:color="B8B0A0" w:sz="4"/>
+              <w:bottom w:val="single" w:color="B8B0A0" w:sz="4"/>
+              <w:right w:val="single" w:color="B8B0A0" w:sz="4"/>
+            </w:tcBorders>
+            <w:tcMar>
+              <w:top w:type="dxa" w:w="60"/>
+              <w:left w:type="dxa" w:w="100"/>
+              <w:bottom w:type="dxa" w:w="60"/>
+              <w:right w:type="dxa" w:w="100"/>
+            </w:tcMar>
+          </w:tcPr>
+          <w:p>
+            <w:r>
+              <w:rPr>
+                <w:rFonts w:ascii="Consolas" w:cs="Consolas" w:eastAsia="Consolas" w:hAnsi="Consolas"/>
+                <w:color w:val="7A4A1A"/>
+                <w:sz w:val="19"/>
+                <w:szCs w:val="19"/>
+              </w:rPr>
+              <w:t xml:space="preserve">meta ana estar_en h:os</w:t>
+            </w:r>
+          </w:p>
+        </w:tc>
+        <w:tc>
+          <w:tcPr>
+            <w:tcW w:type="dxa" w:w="5416"/>
+            <w:tcBorders>
+              <w:top w:val="single" w:color="B8B0A0" w:sz="4"/>
+              <w:left w:val="single" w:color="B8B0A0" w:sz="4"/>
+              <w:bottom w:val="single" w:color="B8B0A0" w:sz="4"/>
+              <w:right w:val="single" w:color="B8B0A0" w:sz="4"/>
+            </w:tcBorders>
+            <w:tcMar>
+              <w:top w:type="dxa" w:w="60"/>
+              <w:left w:type="dxa" w:w="100"/>
+              <w:bottom w:type="dxa" w:w="60"/>
+              <w:right w:type="dxa" w:w="100"/>
+            </w:tcMar>
+          </w:tcPr>
+          <w:p>
+            <w:r>
+              <w:rPr>
+                <w:sz w:val="19"/>
+                <w:szCs w:val="19"/>
+              </w:rPr>
+              <w:t xml:space="preserve">un encargo: una meta que el planificador cumple</w:t>
+            </w:r>
+          </w:p>
+        </w:tc>
+      </w:tr>
+      <w:tr>
+        <w:tc>
+          <w:tcPr>
+            <w:tcW w:type="dxa" w:w="3610"/>
+            <w:tcBorders>
+              <w:top w:val="single" w:color="B8B0A0" w:sz="4"/>
+              <w:left w:val="single" w:color="B8B0A0" w:sz="4"/>
+              <w:bottom w:val="single" w:color="B8B0A0" w:sz="4"/>
+              <w:right w:val="single" w:color="B8B0A0" w:sz="4"/>
+            </w:tcBorders>
+            <w:tcMar>
+              <w:top w:type="dxa" w:w="60"/>
+              <w:left w:type="dxa" w:w="100"/>
+              <w:bottom w:type="dxa" w:w="60"/>
+              <w:right w:type="dxa" w:w="100"/>
+            </w:tcMar>
+          </w:tcPr>
+          <w:p>
+            <w:r>
+              <w:rPr>
+                <w:rFonts w:ascii="Consolas" w:cs="Consolas" w:eastAsia="Consolas" w:hAnsi="Consolas"/>
+                <w:color w:val="7A4A1A"/>
+                <w:sz w:val="19"/>
+                <w:szCs w:val="19"/>
+              </w:rPr>
+              <w:t xml:space="preserve">grande</w:t>
+            </w:r>
+          </w:p>
+        </w:tc>
+        <w:tc>
+          <w:tcPr>
+            <w:tcW w:type="dxa" w:w="5416"/>
+            <w:tcBorders>
+              <w:top w:val="single" w:color="B8B0A0" w:sz="4"/>
+              <w:left w:val="single" w:color="B8B0A0" w:sz="4"/>
+              <w:bottom w:val="single" w:color="B8B0A0" w:sz="4"/>
+              <w:right w:val="single" w:color="B8B0A0" w:sz="4"/>
+            </w:tcBorders>
+            <w:tcMar>
+              <w:top w:type="dxa" w:w="60"/>
+              <w:left w:type="dxa" w:w="100"/>
+              <w:bottom w:type="dxa" w:w="60"/>
+              <w:right w:type="dxa" w:w="100"/>
+            </w:tcMar>
+          </w:tcPr>
+          <w:p>
+            <w:r>
+              <w:rPr>
+                <w:sz w:val="19"/>
+                <w:szCs w:val="19"/>
+              </w:rPr>
+              <w:t xml:space="preserve">la escena empieza algo grande del libro: como mucho una por día (el ritmo)</w:t>
+            </w:r>
+          </w:p>
+        </w:tc>
+      </w:tr>
+    </w:tbl>
     <w:p>
       <w:pPr>
         <w:pStyle w:val="Heading1"/>
@@ -2329,7 +3074,7 @@
         <w:pStyle w:val="Heading1"/>
       </w:pPr>
       <w:r>
-        <w:t xml:space="preserve">3. Los caminos y sus hitos</w:t>
+        <w:t xml:space="preserve">3. Las habilidades y sus hitos</w:t>
       </w:r>
     </w:p>
     <w:p>
@@ -2337,17 +3082,17 @@
         <w:spacing w:after="120"/>
       </w:pPr>
       <w:r>
-        <w:t xml:space="preserve">Las cadenas pasan una vez. Lo que se gana de a poco va por </w:t>
+        <w:t xml:space="preserve">Las cadenas pasan una vez. Lo que se gana de a poco son </w:t>
       </w:r>
       <w:r>
         <w:rPr>
           <w:b/>
           <w:bCs/>
         </w:rPr>
-        <w:t xml:space="preserve">caminos</w:t>
-      </w:r>
-      <w:r>
-        <w:t xml:space="preserve">: un número por camino, como en Princess Maker o Stardew Valley. Lo que Ana hace cada día lo hace subir, y lo que ella elija hacer (estudiar, ayudar en la granja, escribir) decide hacia dónde crece.</w:t>
+        <w:t xml:space="preserve">habilidades</w:t>
+      </w:r>
+      <w:r>
+        <w:t xml:space="preserve">: cualidades (números con dueño) que suben con lo que cada uno hace, como en Princess Maker o Stardew Valley. Las tiene cualquier personaje (Gilbert también estudia), pero los hitos son de Ana. Lo que Ana hace cada día lo hace subir, y lo que ella elija hacer (estudiar, ayudar en la granja, escribir) decide hacia dónde crece.</w:t>
       </w:r>
     </w:p>
     <w:p>
@@ -2432,7 +3177,7 @@
         <w:t xml:space="preserve">+1</w:t>
       </w:r>
       <w:r>
-        <w:t xml:space="preserve"> en cada camino que tenga esa acción, una vez al día por acción y </w:t>
+        <w:t xml:space="preserve"> en cada habilidad que tenga esa acción, una vez al día por acción y </w:t>
       </w:r>
       <w:r>
         <w:rPr>
@@ -2442,7 +3187,7 @@
         <w:t xml:space="preserve">como mucho 2 por día</w:t>
       </w:r>
       <w:r>
-        <w:t xml:space="preserve"> en cada camino.</w:t>
+        <w:t xml:space="preserve"> en cada habilidad.</w:t>
       </w:r>
     </w:p>
     <w:p>
@@ -2500,7 +3245,7 @@
           <w:sz w:val="19"/>
           <w:szCs w:val="19"/>
         </w:rPr>
-        <w:t xml:space="preserve">hito_&lt;camino&gt;_&lt;n&gt;</w:t>
+        <w:t xml:space="preserve">hito_&lt;habilidad&gt;_&lt;n&gt;</w:t>
       </w:r>
       <w:r>
         <w:t xml:space="preserve">. El guion puede tener escenas para cualquier nivel (</w:t>
@@ -2512,7 +3257,7 @@
           <w:sz w:val="19"/>
           <w:szCs w:val="19"/>
         </w:rPr>
-        <w:t xml:space="preserve">si: camino:granja:15</w:t>
+        <w:t xml:space="preserve">si: granja:ana&gt;=15</w:t>
       </w:r>
       <w:r>
         <w:t xml:space="preserve">).</w:t>
@@ -2577,7 +3322,7 @@
           <w:sz w:val="18"/>
           <w:szCs w:val="18"/>
         </w:rPr>
-        <w:t xml:space="preserve">Figura 5. Los tres caminos de partida, con sus hitos y quién se los dice a Ana.</w:t>
+        <w:t xml:space="preserve">Figura 5. Las tres habilidades de partida, con los hitos de Ana y quién se los dice.</w:t>
       </w:r>
     </w:p>
     <w:tbl>
@@ -2627,7 +3372,7 @@
                 <w:sz w:val="19"/>
                 <w:szCs w:val="19"/>
               </w:rPr>
-              <w:t xml:space="preserve">Camino</w:t>
+              <w:t xml:space="preserve">Habilidad</w:t>
             </w:r>
           </w:p>
         </w:tc>
@@ -3693,7 +4438,7 @@
           <w:sz w:val="18"/>
           <w:szCs w:val="18"/>
         </w:rPr>
-        <w:t xml:space="preserve">Figura 6. Un año del juego y el examen de Queen's, que sale del camino del estudio.</w:t>
+        <w:t xml:space="preserve">Figura 6. Un año del juego y el examen de Queen's, que sale de la habilidad del estudio.</w:t>
       </w:r>
     </w:p>
     <w:p>
@@ -3745,7 +4490,7 @@
         <w:pStyle w:val="Heading2"/>
       </w:pPr>
       <w:r>
-        <w:t xml:space="preserve">Un hito o un camino</w:t>
+        <w:t xml:space="preserve">Una habilidad o un hito</w:t>
       </w:r>
     </w:p>
     <w:p>
@@ -3762,7 +4507,7 @@
           <w:sz w:val="19"/>
           <w:szCs w:val="19"/>
         </w:rPr>
-        <w:t xml:space="preserve">src/datos/caminos.txt</w:t>
+        <w:t xml:space="preserve">src/datos/habilidades.txt</w:t>
       </w:r>
       <w:r>
         <w:t xml:space="preserve"> (a mano, o pidiéndoselo a una IA). Por ejemplo:</w:t>
@@ -3927,10 +4672,22 @@
           <w:sz w:val="19"/>
           <w:szCs w:val="19"/>
         </w:rPr>
-        <w:t xml:space="preserve">si: hecho:x, dias_desde:x:1, camino:estudio:30…</w:t>
-      </w:r>
-      <w:r>
-        <w:t xml:space="preserve">) y qué deja (</w:t>
+        <w:t xml:space="preserve">si: hecho:x, dias_desde:x:1, estudio:ana&gt;=30…</w:t>
+      </w:r>
+      <w:r>
+        <w:t xml:space="preserve">); si empieza algo grande del libro, </w:t>
+      </w:r>
+      <w:r>
+        <w:rPr>
+          <w:rFonts w:ascii="Consolas" w:cs="Consolas" w:eastAsia="Consolas" w:hAnsi="Consolas"/>
+          <w:color w:val="7A4A1A"/>
+          <w:sz w:val="19"/>
+          <w:szCs w:val="19"/>
+        </w:rPr>
+        <w:t xml:space="preserve">grande</w:t>
+      </w:r>
+      <w:r>
+        <w:t xml:space="preserve"> y qué deja (</w:t>
       </w:r>
       <w:r>
         <w:rPr>
@@ -4128,7 +4885,732 @@
         <w:spacing w:after="60"/>
       </w:pPr>
       <w:r>
-        <w:t xml:space="preserve">Estado actual: 132 de 132 pasos esperados se cumplen, sin reglas rotas; la regresión, 69 de 71 (las dos que fallan lo hacen a propósito).</w:t>
+        <w:rPr>
+          <w:b/>
+          <w:bCs/>
+        </w:rPr>
+        <w:t xml:space="preserve">El grafo se revisa solo</w:t>
+      </w:r>
+      <w:r>
+        <w:t xml:space="preserve"> con cada build (</w:t>
+      </w:r>
+      <w:r>
+        <w:rPr>
+          <w:rFonts w:ascii="Consolas" w:cs="Consolas" w:eastAsia="Consolas" w:hAnsi="Consolas"/>
+          <w:color w:val="7A4A1A"/>
+          <w:sz w:val="19"/>
+          <w:szCs w:val="19"/>
+        </w:rPr>
+        <w:t xml:space="preserve">tools/grafo.js</w:t>
+      </w:r>
+      <w:r>
+        <w:t xml:space="preserve"> → </w:t>
+      </w:r>
+      <w:r>
+        <w:rPr>
+          <w:rFonts w:ascii="Consolas" w:cs="Consolas" w:eastAsia="Consolas" w:hAnsi="Consolas"/>
+          <w:color w:val="7A4A1A"/>
+          <w:sz w:val="19"/>
+          <w:szCs w:val="19"/>
+        </w:rPr>
+        <w:t xml:space="preserve">trazas/grafo.md</w:t>
+      </w:r>
+      <w:r>
+        <w:t xml:space="preserve">): avisa si una escena o una meta pide un hecho que nada deja (nunca podría pasar), si una condición está mal escrita (una clave o una cualidad que no existe), y qué hechos se dejan sin que nada los lea. Es lo que hace seguro agregar escenas escritas por una IA.</w:t>
+      </w:r>
+    </w:p>
+    <w:p>
+      <w:pPr>
+        <w:pStyle w:val="ListParagraph"/>
+        <w:numPr>
+          <w:ilvl w:val="0"/>
+          <w:numId w:val="2"/>
+        </w:numPr>
+        <w:spacing w:after="60"/>
+      </w:pPr>
+      <w:r>
+        <w:t xml:space="preserve">Estado actual: el grafo, limpio (46 escenas, 30 metas); las cadenas y las habilidades, 36 de 36 pasos; la auditoría completa y la regresión pasan, salvo fallas al azar que al repetirse salen bien (y las dos pruebas de la regresión que fallan a propósito).</w:t>
+      </w:r>
+    </w:p>
+    <w:p>
+      <w:pPr>
+        <w:pStyle w:val="Heading1"/>
+      </w:pPr>
+      <w:r>
+        <w:t xml:space="preserve">6. El estado del arte</w:t>
+      </w:r>
+    </w:p>
+    <w:p>
+      <w:pPr>
+        <w:spacing w:after="120"/>
+      </w:pPr>
+      <w:r>
+        <w:t xml:space="preserve">El motor sigue modelos conocidos de la narrativa interactiva, y toma sus nombres:</w:t>
+      </w:r>
+    </w:p>
+    <w:tbl>
+      <w:tblPr>
+        <w:tblW w:type="dxa" w:w="9638"/>
+        <w:tblBorders>
+          <w:top w:val="single" w:color="auto" w:sz="4"/>
+          <w:left w:val="single" w:color="auto" w:sz="4"/>
+          <w:bottom w:val="single" w:color="auto" w:sz="4"/>
+          <w:right w:val="single" w:color="auto" w:sz="4"/>
+          <w:insideH w:val="single" w:color="auto" w:sz="4"/>
+          <w:insideV w:val="single" w:color="auto" w:sz="4"/>
+        </w:tblBorders>
+      </w:tblPr>
+      <w:tblGrid>
+        <w:gridCol w:w="2582"/>
+        <w:gridCol w:w="2754"/>
+        <w:gridCol w:w="4302"/>
+      </w:tblGrid>
+      <w:tr>
+        <w:trPr>
+          <w:tblHeader/>
+        </w:trPr>
+        <w:tc>
+          <w:tcPr>
+            <w:tcW w:type="dxa" w:w="2582"/>
+            <w:tcBorders>
+              <w:top w:val="single" w:color="B8B0A0" w:sz="4"/>
+              <w:left w:val="single" w:color="B8B0A0" w:sz="4"/>
+              <w:bottom w:val="single" w:color="B8B0A0" w:sz="4"/>
+              <w:right w:val="single" w:color="B8B0A0" w:sz="4"/>
+            </w:tcBorders>
+            <w:shd w:fill="E8E0CC" w:val="clear"/>
+            <w:tcMar>
+              <w:top w:type="dxa" w:w="60"/>
+              <w:left w:type="dxa" w:w="100"/>
+              <w:bottom w:type="dxa" w:w="60"/>
+              <w:right w:type="dxa" w:w="100"/>
+            </w:tcMar>
+          </w:tcPr>
+          <w:p>
+            <w:r>
+              <w:rPr>
+                <w:b/>
+                <w:bCs/>
+                <w:sz w:val="19"/>
+                <w:szCs w:val="19"/>
+              </w:rPr>
+              <w:t xml:space="preserve">En Avonlea</w:t>
+            </w:r>
+          </w:p>
+        </w:tc>
+        <w:tc>
+          <w:tcPr>
+            <w:tcW w:type="dxa" w:w="2754"/>
+            <w:tcBorders>
+              <w:top w:val="single" w:color="B8B0A0" w:sz="4"/>
+              <w:left w:val="single" w:color="B8B0A0" w:sz="4"/>
+              <w:bottom w:val="single" w:color="B8B0A0" w:sz="4"/>
+              <w:right w:val="single" w:color="B8B0A0" w:sz="4"/>
+            </w:tcBorders>
+            <w:shd w:fill="E8E0CC" w:val="clear"/>
+            <w:tcMar>
+              <w:top w:type="dxa" w:w="60"/>
+              <w:left w:type="dxa" w:w="100"/>
+              <w:bottom w:type="dxa" w:w="60"/>
+              <w:right w:type="dxa" w:w="100"/>
+            </w:tcMar>
+          </w:tcPr>
+          <w:p>
+            <w:r>
+              <w:rPr>
+                <w:b/>
+                <w:bCs/>
+                <w:sz w:val="19"/>
+                <w:szCs w:val="19"/>
+              </w:rPr>
+              <w:t xml:space="preserve">Modelo</w:t>
+            </w:r>
+          </w:p>
+        </w:tc>
+        <w:tc>
+          <w:tcPr>
+            <w:tcW w:type="dxa" w:w="4302"/>
+            <w:tcBorders>
+              <w:top w:val="single" w:color="B8B0A0" w:sz="4"/>
+              <w:left w:val="single" w:color="B8B0A0" w:sz="4"/>
+              <w:bottom w:val="single" w:color="B8B0A0" w:sz="4"/>
+              <w:right w:val="single" w:color="B8B0A0" w:sz="4"/>
+            </w:tcBorders>
+            <w:shd w:fill="E8E0CC" w:val="clear"/>
+            <w:tcMar>
+              <w:top w:type="dxa" w:w="60"/>
+              <w:left w:type="dxa" w:w="100"/>
+              <w:bottom w:type="dxa" w:w="60"/>
+              <w:right w:type="dxa" w:w="100"/>
+            </w:tcMar>
+          </w:tcPr>
+          <w:p>
+            <w:r>
+              <w:rPr>
+                <w:b/>
+                <w:bCs/>
+                <w:sz w:val="19"/>
+                <w:szCs w:val="19"/>
+              </w:rPr>
+              <w:t xml:space="preserve">Dónde viene</w:t>
+            </w:r>
+          </w:p>
+        </w:tc>
+      </w:tr>
+      <w:tr>
+        <w:tc>
+          <w:tcPr>
+            <w:tcW w:type="dxa" w:w="2582"/>
+            <w:tcBorders>
+              <w:top w:val="single" w:color="B8B0A0" w:sz="4"/>
+              <w:left w:val="single" w:color="B8B0A0" w:sz="4"/>
+              <w:bottom w:val="single" w:color="B8B0A0" w:sz="4"/>
+              <w:right w:val="single" w:color="B8B0A0" w:sz="4"/>
+            </w:tcBorders>
+            <w:tcMar>
+              <w:top w:type="dxa" w:w="60"/>
+              <w:left w:type="dxa" w:w="100"/>
+              <w:bottom w:type="dxa" w:w="60"/>
+              <w:right w:type="dxa" w:w="100"/>
+            </w:tcMar>
+          </w:tcPr>
+          <w:p>
+            <w:r>
+              <w:rPr>
+                <w:sz w:val="19"/>
+                <w:szCs w:val="19"/>
+              </w:rPr>
+              <w:t xml:space="preserve">El estado: hechos y cualidades</w:t>
+            </w:r>
+          </w:p>
+        </w:tc>
+        <w:tc>
+          <w:tcPr>
+            <w:tcW w:type="dxa" w:w="2754"/>
+            <w:tcBorders>
+              <w:top w:val="single" w:color="B8B0A0" w:sz="4"/>
+              <w:left w:val="single" w:color="B8B0A0" w:sz="4"/>
+              <w:bottom w:val="single" w:color="B8B0A0" w:sz="4"/>
+              <w:right w:val="single" w:color="B8B0A0" w:sz="4"/>
+            </w:tcBorders>
+            <w:tcMar>
+              <w:top w:type="dxa" w:w="60"/>
+              <w:left w:type="dxa" w:w="100"/>
+              <w:bottom w:type="dxa" w:w="60"/>
+              <w:right w:type="dxa" w:w="100"/>
+            </w:tcMar>
+          </w:tcPr>
+          <w:p>
+            <w:r>
+              <w:rPr>
+                <w:sz w:val="19"/>
+                <w:szCs w:val="19"/>
+              </w:rPr>
+              <w:t xml:space="preserve">Quality-based narrative</w:t>
+            </w:r>
+          </w:p>
+        </w:tc>
+        <w:tc>
+          <w:tcPr>
+            <w:tcW w:type="dxa" w:w="4302"/>
+            <w:tcBorders>
+              <w:top w:val="single" w:color="B8B0A0" w:sz="4"/>
+              <w:left w:val="single" w:color="B8B0A0" w:sz="4"/>
+              <w:bottom w:val="single" w:color="B8B0A0" w:sz="4"/>
+              <w:right w:val="single" w:color="B8B0A0" w:sz="4"/>
+            </w:tcBorders>
+            <w:tcMar>
+              <w:top w:type="dxa" w:w="60"/>
+              <w:left w:type="dxa" w:w="100"/>
+              <w:bottom w:type="dxa" w:w="60"/>
+              <w:right w:type="dxa" w:w="100"/>
+            </w:tcMar>
+          </w:tcPr>
+          <w:p>
+            <w:r>
+              <w:rPr>
+                <w:sz w:val="19"/>
+                <w:szCs w:val="19"/>
+              </w:rPr>
+              <w:t xml:space="preserve">Failbetter (Fallen London, StoryNexus): el mundo es un diccionario de cualidades, números que las escenas leen y cambian.</w:t>
+            </w:r>
+          </w:p>
+        </w:tc>
+      </w:tr>
+      <w:tr>
+        <w:tc>
+          <w:tcPr>
+            <w:tcW w:type="dxa" w:w="2582"/>
+            <w:tcBorders>
+              <w:top w:val="single" w:color="B8B0A0" w:sz="4"/>
+              <w:left w:val="single" w:color="B8B0A0" w:sz="4"/>
+              <w:bottom w:val="single" w:color="B8B0A0" w:sz="4"/>
+              <w:right w:val="single" w:color="B8B0A0" w:sz="4"/>
+            </w:tcBorders>
+            <w:tcMar>
+              <w:top w:type="dxa" w:w="60"/>
+              <w:left w:type="dxa" w:w="100"/>
+              <w:bottom w:type="dxa" w:w="60"/>
+              <w:right w:type="dxa" w:w="100"/>
+            </w:tcMar>
+          </w:tcPr>
+          <w:p>
+            <w:r>
+              <w:rPr>
+                <w:sz w:val="19"/>
+                <w:szCs w:val="19"/>
+              </w:rPr>
+              <w:t xml:space="preserve">Las escenas</w:t>
+            </w:r>
+          </w:p>
+        </w:tc>
+        <w:tc>
+          <w:tcPr>
+            <w:tcW w:type="dxa" w:w="2754"/>
+            <w:tcBorders>
+              <w:top w:val="single" w:color="B8B0A0" w:sz="4"/>
+              <w:left w:val="single" w:color="B8B0A0" w:sz="4"/>
+              <w:bottom w:val="single" w:color="B8B0A0" w:sz="4"/>
+              <w:right w:val="single" w:color="B8B0A0" w:sz="4"/>
+            </w:tcBorders>
+            <w:tcMar>
+              <w:top w:type="dxa" w:w="60"/>
+              <w:left w:type="dxa" w:w="100"/>
+              <w:bottom w:type="dxa" w:w="60"/>
+              <w:right w:type="dxa" w:w="100"/>
+            </w:tcMar>
+          </w:tcPr>
+          <w:p>
+            <w:r>
+              <w:rPr>
+                <w:sz w:val="19"/>
+                <w:szCs w:val="19"/>
+              </w:rPr>
+              <w:t xml:space="preserve">Storylets</w:t>
+            </w:r>
+          </w:p>
+        </w:tc>
+        <w:tc>
+          <w:tcPr>
+            <w:tcW w:type="dxa" w:w="4302"/>
+            <w:tcBorders>
+              <w:top w:val="single" w:color="B8B0A0" w:sz="4"/>
+              <w:left w:val="single" w:color="B8B0A0" w:sz="4"/>
+              <w:bottom w:val="single" w:color="B8B0A0" w:sz="4"/>
+              <w:right w:val="single" w:color="B8B0A0" w:sz="4"/>
+            </w:tcBorders>
+            <w:tcMar>
+              <w:top w:type="dxa" w:w="60"/>
+              <w:left w:type="dxa" w:w="100"/>
+              <w:bottom w:type="dxa" w:w="60"/>
+              <w:right w:type="dxa" w:w="100"/>
+            </w:tcMar>
+          </w:tcPr>
+          <w:p>
+            <w:r>
+              <w:rPr>
+                <w:sz w:val="19"/>
+                <w:szCs w:val="19"/>
+              </w:rPr>
+              <w:t xml:space="preserve">Kreminski y Wardrip-Fruin, «Sketching a Map of the Storylets Design Space» (ICIDS 2018): piezas de historia con precondiciones y efectos, «como teselas de un mosaico».</w:t>
+            </w:r>
+          </w:p>
+        </w:tc>
+      </w:tr>
+      <w:tr>
+        <w:tc>
+          <w:tcPr>
+            <w:tcW w:type="dxa" w:w="2582"/>
+            <w:tcBorders>
+              <w:top w:val="single" w:color="B8B0A0" w:sz="4"/>
+              <w:left w:val="single" w:color="B8B0A0" w:sz="4"/>
+              <w:bottom w:val="single" w:color="B8B0A0" w:sz="4"/>
+              <w:right w:val="single" w:color="B8B0A0" w:sz="4"/>
+            </w:tcBorders>
+            <w:tcMar>
+              <w:top w:type="dxa" w:w="60"/>
+              <w:left w:type="dxa" w:w="100"/>
+              <w:bottom w:type="dxa" w:w="60"/>
+              <w:right w:type="dxa" w:w="100"/>
+            </w:tcMar>
+          </w:tcPr>
+          <w:p>
+            <w:r>
+              <w:rPr>
+                <w:sz w:val="19"/>
+                <w:szCs w:val="19"/>
+              </w:rPr>
+              <w:t xml:space="preserve">Gana la escena más específica</w:t>
+            </w:r>
+          </w:p>
+        </w:tc>
+        <w:tc>
+          <w:tcPr>
+            <w:tcW w:type="dxa" w:w="2754"/>
+            <w:tcBorders>
+              <w:top w:val="single" w:color="B8B0A0" w:sz="4"/>
+              <w:left w:val="single" w:color="B8B0A0" w:sz="4"/>
+              <w:bottom w:val="single" w:color="B8B0A0" w:sz="4"/>
+              <w:right w:val="single" w:color="B8B0A0" w:sz="4"/>
+            </w:tcBorders>
+            <w:tcMar>
+              <w:top w:type="dxa" w:w="60"/>
+              <w:left w:type="dxa" w:w="100"/>
+              <w:bottom w:type="dxa" w:w="60"/>
+              <w:right w:type="dxa" w:w="100"/>
+            </w:tcMar>
+          </w:tcPr>
+          <w:p>
+            <w:r>
+              <w:rPr>
+                <w:sz w:val="19"/>
+                <w:szCs w:val="19"/>
+              </w:rPr>
+              <w:t xml:space="preserve">Reglas de diálogo por especificidad</w:t>
+            </w:r>
+          </w:p>
+        </w:tc>
+        <w:tc>
+          <w:tcPr>
+            <w:tcW w:type="dxa" w:w="4302"/>
+            <w:tcBorders>
+              <w:top w:val="single" w:color="B8B0A0" w:sz="4"/>
+              <w:left w:val="single" w:color="B8B0A0" w:sz="4"/>
+              <w:bottom w:val="single" w:color="B8B0A0" w:sz="4"/>
+              <w:right w:val="single" w:color="B8B0A0" w:sz="4"/>
+            </w:tcBorders>
+            <w:tcMar>
+              <w:top w:type="dxa" w:w="60"/>
+              <w:left w:type="dxa" w:w="100"/>
+              <w:bottom w:type="dxa" w:w="60"/>
+              <w:right w:type="dxa" w:w="100"/>
+            </w:tcMar>
+          </w:tcPr>
+          <w:p>
+            <w:r>
+              <w:rPr>
+                <w:sz w:val="19"/>
+                <w:szCs w:val="19"/>
+              </w:rPr>
+              <w:t xml:space="preserve">Elan Ruskin, Valve (Left 4 Dead), GDC 2012: miles de líneas con condiciones; gana la que cumple más, y las generales quedan de respaldo.</w:t>
+            </w:r>
+          </w:p>
+        </w:tc>
+      </w:tr>
+      <w:tr>
+        <w:tc>
+          <w:tcPr>
+            <w:tcW w:type="dxa" w:w="2582"/>
+            <w:tcBorders>
+              <w:top w:val="single" w:color="B8B0A0" w:sz="4"/>
+              <w:left w:val="single" w:color="B8B0A0" w:sz="4"/>
+              <w:bottom w:val="single" w:color="B8B0A0" w:sz="4"/>
+              <w:right w:val="single" w:color="B8B0A0" w:sz="4"/>
+            </w:tcBorders>
+            <w:tcMar>
+              <w:top w:type="dxa" w:w="60"/>
+              <w:left w:type="dxa" w:w="100"/>
+              <w:bottom w:type="dxa" w:w="60"/>
+              <w:right w:type="dxa" w:w="100"/>
+            </w:tcMar>
+          </w:tcPr>
+          <w:p>
+            <w:r>
+              <w:rPr>
+                <w:sz w:val="19"/>
+                <w:szCs w:val="19"/>
+              </w:rPr>
+              <w:t xml:space="preserve">El ritmo: una escena grande por día</w:t>
+            </w:r>
+          </w:p>
+        </w:tc>
+        <w:tc>
+          <w:tcPr>
+            <w:tcW w:type="dxa" w:w="2754"/>
+            <w:tcBorders>
+              <w:top w:val="single" w:color="B8B0A0" w:sz="4"/>
+              <w:left w:val="single" w:color="B8B0A0" w:sz="4"/>
+              <w:bottom w:val="single" w:color="B8B0A0" w:sz="4"/>
+              <w:right w:val="single" w:color="B8B0A0" w:sz="4"/>
+            </w:tcBorders>
+            <w:tcMar>
+              <w:top w:type="dxa" w:w="60"/>
+              <w:left w:type="dxa" w:w="100"/>
+              <w:bottom w:type="dxa" w:w="60"/>
+              <w:right w:type="dxa" w:w="100"/>
+            </w:tcMar>
+          </w:tcPr>
+          <w:p>
+            <w:r>
+              <w:rPr>
+                <w:sz w:val="19"/>
+                <w:szCs w:val="19"/>
+              </w:rPr>
+              <w:t xml:space="preserve">Drama manager</w:t>
+            </w:r>
+          </w:p>
+        </w:tc>
+        <w:tc>
+          <w:tcPr>
+            <w:tcW w:type="dxa" w:w="4302"/>
+            <w:tcBorders>
+              <w:top w:val="single" w:color="B8B0A0" w:sz="4"/>
+              <w:left w:val="single" w:color="B8B0A0" w:sz="4"/>
+              <w:bottom w:val="single" w:color="B8B0A0" w:sz="4"/>
+              <w:right w:val="single" w:color="B8B0A0" w:sz="4"/>
+            </w:tcBorders>
+            <w:tcMar>
+              <w:top w:type="dxa" w:w="60"/>
+              <w:left w:type="dxa" w:w="100"/>
+              <w:bottom w:type="dxa" w:w="60"/>
+              <w:right w:type="dxa" w:w="100"/>
+            </w:tcMar>
+          </w:tcPr>
+          <w:p>
+            <w:r>
+              <w:rPr>
+                <w:sz w:val="19"/>
+                <w:szCs w:val="19"/>
+              </w:rPr>
+              <w:t xml:space="preserve">Mateas y Stern, Façade (2003), que ordena las escenas según la tensión; el narrador de RimWorld, que decide cuándo pasa algo grande.</w:t>
+            </w:r>
+          </w:p>
+        </w:tc>
+      </w:tr>
+      <w:tr>
+        <w:tc>
+          <w:tcPr>
+            <w:tcW w:type="dxa" w:w="2582"/>
+            <w:tcBorders>
+              <w:top w:val="single" w:color="B8B0A0" w:sz="4"/>
+              <w:left w:val="single" w:color="B8B0A0" w:sz="4"/>
+              <w:bottom w:val="single" w:color="B8B0A0" w:sz="4"/>
+              <w:right w:val="single" w:color="B8B0A0" w:sz="4"/>
+            </w:tcBorders>
+            <w:tcMar>
+              <w:top w:type="dxa" w:w="60"/>
+              <w:left w:type="dxa" w:w="100"/>
+              <w:bottom w:type="dxa" w:w="60"/>
+              <w:right w:type="dxa" w:w="100"/>
+            </w:tcMar>
+          </w:tcPr>
+          <w:p>
+            <w:r>
+              <w:rPr>
+                <w:sz w:val="19"/>
+                <w:szCs w:val="19"/>
+              </w:rPr>
+              <w:t xml:space="preserve">El planificador</w:t>
+            </w:r>
+          </w:p>
+        </w:tc>
+        <w:tc>
+          <w:tcPr>
+            <w:tcW w:type="dxa" w:w="2754"/>
+            <w:tcBorders>
+              <w:top w:val="single" w:color="B8B0A0" w:sz="4"/>
+              <w:left w:val="single" w:color="B8B0A0" w:sz="4"/>
+              <w:bottom w:val="single" w:color="B8B0A0" w:sz="4"/>
+              <w:right w:val="single" w:color="B8B0A0" w:sz="4"/>
+            </w:tcBorders>
+            <w:tcMar>
+              <w:top w:type="dxa" w:w="60"/>
+              <w:left w:type="dxa" w:w="100"/>
+              <w:bottom w:type="dxa" w:w="60"/>
+              <w:right w:type="dxa" w:w="100"/>
+            </w:tcMar>
+          </w:tcPr>
+          <w:p>
+            <w:r>
+              <w:rPr>
+                <w:sz w:val="19"/>
+                <w:szCs w:val="19"/>
+              </w:rPr>
+              <w:t xml:space="preserve">GOAP (planificación por metas)</w:t>
+            </w:r>
+          </w:p>
+        </w:tc>
+        <w:tc>
+          <w:tcPr>
+            <w:tcW w:type="dxa" w:w="4302"/>
+            <w:tcBorders>
+              <w:top w:val="single" w:color="B8B0A0" w:sz="4"/>
+              <w:left w:val="single" w:color="B8B0A0" w:sz="4"/>
+              <w:bottom w:val="single" w:color="B8B0A0" w:sz="4"/>
+              <w:right w:val="single" w:color="B8B0A0" w:sz="4"/>
+            </w:tcBorders>
+            <w:tcMar>
+              <w:top w:type="dxa" w:w="60"/>
+              <w:left w:type="dxa" w:w="100"/>
+              <w:bottom w:type="dxa" w:w="60"/>
+              <w:right w:type="dxa" w:w="100"/>
+            </w:tcMar>
+          </w:tcPr>
+          <w:p>
+            <w:r>
+              <w:rPr>
+                <w:sz w:val="19"/>
+                <w:szCs w:val="19"/>
+              </w:rPr>
+              <w:t xml:space="preserve">Jeff Orkin, F.E.A.R. (GDC 2006): acciones con precondiciones y efectos, y A* para el «cómo».</w:t>
+            </w:r>
+          </w:p>
+        </w:tc>
+      </w:tr>
+      <w:tr>
+        <w:tc>
+          <w:tcPr>
+            <w:tcW w:type="dxa" w:w="2582"/>
+            <w:tcBorders>
+              <w:top w:val="single" w:color="B8B0A0" w:sz="4"/>
+              <w:left w:val="single" w:color="B8B0A0" w:sz="4"/>
+              <w:bottom w:val="single" w:color="B8B0A0" w:sz="4"/>
+              <w:right w:val="single" w:color="B8B0A0" w:sz="4"/>
+            </w:tcBorders>
+            <w:tcMar>
+              <w:top w:type="dxa" w:w="60"/>
+              <w:left w:type="dxa" w:w="100"/>
+              <w:bottom w:type="dxa" w:w="60"/>
+              <w:right w:type="dxa" w:w="100"/>
+            </w:tcMar>
+          </w:tcPr>
+          <w:p>
+            <w:r>
+              <w:rPr>
+                <w:sz w:val="19"/>
+                <w:szCs w:val="19"/>
+              </w:rPr>
+              <w:t xml:space="preserve">Quién sabe qué</w:t>
+            </w:r>
+          </w:p>
+        </w:tc>
+        <w:tc>
+          <w:tcPr>
+            <w:tcW w:type="dxa" w:w="2754"/>
+            <w:tcBorders>
+              <w:top w:val="single" w:color="B8B0A0" w:sz="4"/>
+              <w:left w:val="single" w:color="B8B0A0" w:sz="4"/>
+              <w:bottom w:val="single" w:color="B8B0A0" w:sz="4"/>
+              <w:right w:val="single" w:color="B8B0A0" w:sz="4"/>
+            </w:tcBorders>
+            <w:tcMar>
+              <w:top w:type="dxa" w:w="60"/>
+              <w:left w:type="dxa" w:w="100"/>
+              <w:bottom w:type="dxa" w:w="60"/>
+              <w:right w:type="dxa" w:w="100"/>
+            </w:tcMar>
+          </w:tcPr>
+          <w:p>
+            <w:r>
+              <w:rPr>
+                <w:sz w:val="19"/>
+                <w:szCs w:val="19"/>
+              </w:rPr>
+              <w:t xml:space="preserve">Conocimiento por personaje</w:t>
+            </w:r>
+          </w:p>
+        </w:tc>
+        <w:tc>
+          <w:tcPr>
+            <w:tcW w:type="dxa" w:w="4302"/>
+            <w:tcBorders>
+              <w:top w:val="single" w:color="B8B0A0" w:sz="4"/>
+              <w:left w:val="single" w:color="B8B0A0" w:sz="4"/>
+              <w:bottom w:val="single" w:color="B8B0A0" w:sz="4"/>
+              <w:right w:val="single" w:color="B8B0A0" w:sz="4"/>
+            </w:tcBorders>
+            <w:tcMar>
+              <w:top w:type="dxa" w:w="60"/>
+              <w:left w:type="dxa" w:w="100"/>
+              <w:bottom w:type="dxa" w:w="60"/>
+              <w:right w:type="dxa" w:w="100"/>
+            </w:tcMar>
+          </w:tcPr>
+          <w:p>
+            <w:r>
+              <w:rPr>
+                <w:sz w:val="19"/>
+                <w:szCs w:val="19"/>
+              </w:rPr>
+              <w:t xml:space="preserve">Versu (Evans y Short) y las reglas de Valve: cada personaje sabe lo suyo; contar algo es un efecto.</w:t>
+            </w:r>
+          </w:p>
+        </w:tc>
+      </w:tr>
+    </w:tbl>
+    <w:p>
+      <w:pPr>
+        <w:spacing w:after="120"/>
+      </w:pPr>
+      <w:r>
+        <w:rPr>
+          <w:b/>
+          <w:bCs/>
+        </w:rPr>
+        <w:t xml:space="preserve">Lo que queda por hacer</w:t>
+      </w:r>
+      <w:r>
+        <w:t xml:space="preserve">, del mismo estado del arte:</w:t>
+      </w:r>
+    </w:p>
+    <w:p>
+      <w:pPr>
+        <w:pStyle w:val="ListParagraph"/>
+        <w:numPr>
+          <w:ilvl w:val="0"/>
+          <w:numId w:val="2"/>
+        </w:numPr>
+        <w:spacing w:after="60"/>
+      </w:pPr>
+      <w:r>
+        <w:rPr>
+          <w:b/>
+          <w:bCs/>
+        </w:rPr>
+        <w:t xml:space="preserve">Prácticas sociales</w:t>
+      </w:r>
+      <w:r>
+        <w:t xml:space="preserve"> (Versu): las actividades de varios personajes (el té, la cena, el picnic) como estructuras con roles. Hoy el té es un caso especial.</w:t>
+      </w:r>
+    </w:p>
+    <w:p>
+      <w:pPr>
+        <w:pStyle w:val="ListParagraph"/>
+        <w:numPr>
+          <w:ilvl w:val="0"/>
+          <w:numId w:val="2"/>
+        </w:numPr>
+        <w:spacing w:after="60"/>
+      </w:pPr>
+      <w:r>
+        <w:rPr>
+          <w:b/>
+          <w:bCs/>
+        </w:rPr>
+        <w:t xml:space="preserve">La agenda como escenas que se repiten</w:t>
+      </w:r>
+      <w:r>
+        <w:t xml:space="preserve">: hoy la agenda de los personajes está en el código; pasarla al guion la dejaría en el mismo formato que lo demás.</w:t>
+      </w:r>
+    </w:p>
+    <w:p>
+      <w:pPr>
+        <w:pStyle w:val="ListParagraph"/>
+        <w:numPr>
+          <w:ilvl w:val="0"/>
+          <w:numId w:val="2"/>
+        </w:numPr>
+        <w:spacing w:after="60"/>
+      </w:pPr>
+      <w:r>
+        <w:rPr>
+          <w:b/>
+          <w:bCs/>
+        </w:rPr>
+        <w:t xml:space="preserve">Cualidades que bajan solas</w:t>
+      </w:r>
+      <w:r>
+        <w:t xml:space="preserve"> (el afecto que se enfría): bastaría un efecto en una rutina diaria.</w:t>
       </w:r>
     </w:p>
     <w:sectPr>

</xml_diff>

<commit_message>
Tiempos más reales: las cadenas esperan lo que corresponde al libro (un mes ≈ 4-5 días)
- El broche, 5 días de amigas; el té con Diana, 10; el crup, 12 días después
  de la prohibición; la tía Josephine, 25 días de amigas; las paces con
  Gilbert, 28 días después de «¡Zanahorias!»; los Allan, 14 días después de
  la escuela dominical, y el pastel 3 días después de invitarlos.
- El examen de Queen's, desde el segundo verano, con más estudio (20/50/85);
  los hitos de las habilidades, más espaciados.
- Condiciones dia_juego:n y dias_desde de una meta del cuaderno.
- Minnie May no habla del crup antes del crup.
- Documentos y diagramas con los tiempos; las pruebas preparan el pasado
  con los tiempos nuevos.

Co-Authored-By: Claude Opus 5.5 <noreply@anthropic.com>
Claude-Session: https://claude.ai/code/session_01VY3w9XmL1TrbHxLtQe81Lv
</commit_message>
<xml_diff>
--- a/docs/hitos-y-grafos.docx
+++ b/docs/hitos-y-grafos.docx
@@ -2856,7 +2856,7 @@
                 <w:sz w:val="19"/>
                 <w:szCs w:val="19"/>
               </w:rPr>
-              <w:t xml:space="preserve">amigas hace 2 días, sin prohibición, no el día del perdón</w:t>
+              <w:t xml:space="preserve">amigas hace 25 días, sin prohibición; escena grande (no el mismo día que otra)</w:t>
             </w:r>
           </w:p>
         </w:tc>
@@ -3026,14 +3026,14 @@
         <w:t xml:space="preserve">Los Allan</w:t>
       </w:r>
       <w:r>
-        <w:t xml:space="preserve">: después de ir a la escuela dominical, Marilla los invita; </w:t>
+        <w:t xml:space="preserve">: 14 días después de la primera escuela dominical, Marilla los invita; </w:t>
       </w:r>
       <w:r>
         <w:rPr>
           <w:b/>
           <w:bCs/>
         </w:rPr>
-        <w:t xml:space="preserve">al día siguiente</w:t>
+        <w:t xml:space="preserve">tres días después</w:t>
       </w:r>
       <w:r>
         <w:t xml:space="preserve"> viene la Sra. Allan y, </w:t>
@@ -3513,7 +3513,7 @@
                 <w:sz w:val="19"/>
                 <w:szCs w:val="19"/>
               </w:rPr>
-              <w:t xml:space="preserve">10</w:t>
+              <w:t xml:space="preserve">20</w:t>
             </w:r>
           </w:p>
         </w:tc>
@@ -3611,7 +3611,7 @@
                 <w:sz w:val="19"/>
                 <w:szCs w:val="19"/>
               </w:rPr>
-              <w:t xml:space="preserve">30</w:t>
+              <w:t xml:space="preserve">50</w:t>
             </w:r>
           </w:p>
         </w:tc>
@@ -3709,7 +3709,7 @@
                 <w:sz w:val="19"/>
                 <w:szCs w:val="19"/>
               </w:rPr>
-              <w:t xml:space="preserve">60</w:t>
+              <w:t xml:space="preserve">85</w:t>
             </w:r>
           </w:p>
         </w:tc>
@@ -3815,7 +3815,7 @@
                 <w:sz w:val="19"/>
                 <w:szCs w:val="19"/>
               </w:rPr>
-              <w:t xml:space="preserve">5</w:t>
+              <w:t xml:space="preserve">10</w:t>
             </w:r>
           </w:p>
         </w:tc>
@@ -3913,7 +3913,7 @@
                 <w:sz w:val="19"/>
                 <w:szCs w:val="19"/>
               </w:rPr>
-              <w:t xml:space="preserve">15</w:t>
+              <w:t xml:space="preserve">40</w:t>
             </w:r>
           </w:p>
         </w:tc>
@@ -4011,7 +4011,7 @@
                 <w:sz w:val="19"/>
                 <w:szCs w:val="19"/>
               </w:rPr>
-              <w:t xml:space="preserve">30</w:t>
+              <w:t xml:space="preserve">80</w:t>
             </w:r>
           </w:p>
         </w:tc>
@@ -4117,7 +4117,7 @@
                 <w:sz w:val="19"/>
                 <w:szCs w:val="19"/>
               </w:rPr>
-              <w:t xml:space="preserve">5</w:t>
+              <w:t xml:space="preserve">10</w:t>
             </w:r>
           </w:p>
         </w:tc>
@@ -4215,7 +4215,7 @@
                 <w:sz w:val="19"/>
                 <w:szCs w:val="19"/>
               </w:rPr>
-              <w:t xml:space="preserve">15</w:t>
+              <w:t xml:space="preserve">30</w:t>
             </w:r>
           </w:p>
         </w:tc>
@@ -4313,7 +4313,7 @@
                 <w:sz w:val="19"/>
                 <w:szCs w:val="19"/>
               </w:rPr>
-              <w:t xml:space="preserve">30</w:t>
+              <w:t xml:space="preserve">60</w:t>
             </w:r>
           </w:p>
         </w:tc>
@@ -4463,10 +4463,10 @@
           <w:b/>
           <w:bCs/>
         </w:rPr>
-        <w:t xml:space="preserve">primer día de cada verano</w:t>
-      </w:r>
-      <w:r>
-        <w:t xml:space="preserve">, en la cocina con Marilla, es el examen: si Ana tiene menos de 10 en el estudio no la mandan todavía; con 10 a 29 no alcanza (y hay otro examen al verano siguiente); con 30 entra; con 60, queda primera, empatada con Gilbert.</w:t>
+        <w:t xml:space="preserve">primer día de cada verano, desde el segundo año</w:t>
+      </w:r>
+      <w:r>
+        <w:t xml:space="preserve">, en la cocina con Marilla, es el examen: si Ana tiene menos de 20 en el estudio no la mandan todavía; con 20 a 49 no alcanza (y hay otro examen al verano siguiente); con 50 entra; con 85, queda primera, empatada con Gilbert.</w:t>
       </w:r>
     </w:p>
     <w:p>
@@ -4474,9 +4474,945 @@
         <w:spacing w:after="120"/>
       </w:pPr>
       <w:r>
-        <w:t xml:space="preserve">Con todo el esfuerzo (2 por día de clases), 30 se alcanza en la primera primavera, antes del primer examen; 60 toma casi un año.</w:t>
-      </w:r>
-    </w:p>
+        <w:t xml:space="preserve">Con todo el esfuerzo (2 por día de clases), 50 se alcanza en poco más de medio año de clases y 85 en casi un año entero; en el libro, Ana se prepara unos dos años.</w:t>
+      </w:r>
+    </w:p>
+    <w:p>
+      <w:pPr>
+        <w:pStyle w:val="Heading2"/>
+      </w:pPr>
+      <w:r>
+        <w:t xml:space="preserve">3.2 Los tiempos del libro</w:t>
+      </w:r>
+    </w:p>
+    <w:p>
+      <w:pPr>
+        <w:spacing w:after="120"/>
+      </w:pPr>
+      <w:r>
+        <w:t xml:space="preserve">Un año del juego son 56 días y en el libro pasan unos cuatro años: </w:t>
+      </w:r>
+      <w:r>
+        <w:rPr>
+          <w:b/>
+          <w:bCs/>
+        </w:rPr>
+        <w:t xml:space="preserve">un mes del libro son unos 4 o 5 días del juego</w:t>
+      </w:r>
+      <w:r>
+        <w:t xml:space="preserve">. Las cadenas esperan lo que corresponde:</w:t>
+      </w:r>
+    </w:p>
+    <w:tbl>
+      <w:tblPr>
+        <w:tblW w:type="dxa" w:w="9026"/>
+        <w:tblBorders>
+          <w:top w:val="single" w:color="auto" w:sz="4"/>
+          <w:left w:val="single" w:color="auto" w:sz="4"/>
+          <w:bottom w:val="single" w:color="auto" w:sz="4"/>
+          <w:right w:val="single" w:color="auto" w:sz="4"/>
+          <w:insideH w:val="single" w:color="auto" w:sz="4"/>
+          <w:insideV w:val="single" w:color="auto" w:sz="4"/>
+        </w:tblBorders>
+      </w:tblPr>
+      <w:tblGrid>
+        <w:gridCol w:w="3472"/>
+        <w:gridCol w:w="2777"/>
+        <w:gridCol w:w="2777"/>
+      </w:tblGrid>
+      <w:tr>
+        <w:trPr>
+          <w:tblHeader/>
+        </w:trPr>
+        <w:tc>
+          <w:tcPr>
+            <w:tcW w:type="dxa" w:w="3472"/>
+            <w:tcBorders>
+              <w:top w:val="single" w:color="B8B0A0" w:sz="4"/>
+              <w:left w:val="single" w:color="B8B0A0" w:sz="4"/>
+              <w:bottom w:val="single" w:color="B8B0A0" w:sz="4"/>
+              <w:right w:val="single" w:color="B8B0A0" w:sz="4"/>
+            </w:tcBorders>
+            <w:shd w:fill="E8E0CC" w:val="clear"/>
+            <w:tcMar>
+              <w:top w:type="dxa" w:w="60"/>
+              <w:left w:type="dxa" w:w="100"/>
+              <w:bottom w:type="dxa" w:w="60"/>
+              <w:right w:type="dxa" w:w="100"/>
+            </w:tcMar>
+          </w:tcPr>
+          <w:p>
+            <w:r>
+              <w:rPr>
+                <w:b/>
+                <w:bCs/>
+                <w:sz w:val="19"/>
+                <w:szCs w:val="19"/>
+              </w:rPr>
+              <w:t xml:space="preserve">Cadena</w:t>
+            </w:r>
+          </w:p>
+        </w:tc>
+        <w:tc>
+          <w:tcPr>
+            <w:tcW w:type="dxa" w:w="2777"/>
+            <w:tcBorders>
+              <w:top w:val="single" w:color="B8B0A0" w:sz="4"/>
+              <w:left w:val="single" w:color="B8B0A0" w:sz="4"/>
+              <w:bottom w:val="single" w:color="B8B0A0" w:sz="4"/>
+              <w:right w:val="single" w:color="B8B0A0" w:sz="4"/>
+            </w:tcBorders>
+            <w:shd w:fill="E8E0CC" w:val="clear"/>
+            <w:tcMar>
+              <w:top w:type="dxa" w:w="60"/>
+              <w:left w:type="dxa" w:w="100"/>
+              <w:bottom w:type="dxa" w:w="60"/>
+              <w:right w:type="dxa" w:w="100"/>
+            </w:tcMar>
+          </w:tcPr>
+          <w:p>
+            <w:r>
+              <w:rPr>
+                <w:b/>
+                <w:bCs/>
+                <w:sz w:val="19"/>
+                <w:szCs w:val="19"/>
+              </w:rPr>
+              <w:t xml:space="preserve">En el libro</w:t>
+            </w:r>
+          </w:p>
+        </w:tc>
+        <w:tc>
+          <w:tcPr>
+            <w:tcW w:type="dxa" w:w="2777"/>
+            <w:tcBorders>
+              <w:top w:val="single" w:color="B8B0A0" w:sz="4"/>
+              <w:left w:val="single" w:color="B8B0A0" w:sz="4"/>
+              <w:bottom w:val="single" w:color="B8B0A0" w:sz="4"/>
+              <w:right w:val="single" w:color="B8B0A0" w:sz="4"/>
+            </w:tcBorders>
+            <w:shd w:fill="E8E0CC" w:val="clear"/>
+            <w:tcMar>
+              <w:top w:type="dxa" w:w="60"/>
+              <w:left w:type="dxa" w:w="100"/>
+              <w:bottom w:type="dxa" w:w="60"/>
+              <w:right w:type="dxa" w:w="100"/>
+            </w:tcMar>
+          </w:tcPr>
+          <w:p>
+            <w:r>
+              <w:rPr>
+                <w:b/>
+                <w:bCs/>
+                <w:sz w:val="19"/>
+                <w:szCs w:val="19"/>
+              </w:rPr>
+              <w:t xml:space="preserve">En el juego</w:t>
+            </w:r>
+          </w:p>
+        </w:tc>
+      </w:tr>
+      <w:tr>
+        <w:tc>
+          <w:tcPr>
+            <w:tcW w:type="dxa" w:w="3472"/>
+            <w:tcBorders>
+              <w:top w:val="single" w:color="B8B0A0" w:sz="4"/>
+              <w:left w:val="single" w:color="B8B0A0" w:sz="4"/>
+              <w:bottom w:val="single" w:color="B8B0A0" w:sz="4"/>
+              <w:right w:val="single" w:color="B8B0A0" w:sz="4"/>
+            </w:tcBorders>
+            <w:tcMar>
+              <w:top w:type="dxa" w:w="60"/>
+              <w:left w:type="dxa" w:w="100"/>
+              <w:bottom w:type="dxa" w:w="60"/>
+              <w:right w:type="dxa" w:w="100"/>
+            </w:tcMar>
+          </w:tcPr>
+          <w:p>
+            <w:r>
+              <w:rPr>
+                <w:sz w:val="19"/>
+                <w:szCs w:val="19"/>
+              </w:rPr>
+              <w:t xml:space="preserve">Marilla la lleva donde los Barry</w:t>
+            </w:r>
+          </w:p>
+        </w:tc>
+        <w:tc>
+          <w:tcPr>
+            <w:tcW w:type="dxa" w:w="2777"/>
+            <w:tcBorders>
+              <w:top w:val="single" w:color="B8B0A0" w:sz="4"/>
+              <w:left w:val="single" w:color="B8B0A0" w:sz="4"/>
+              <w:bottom w:val="single" w:color="B8B0A0" w:sz="4"/>
+              <w:right w:val="single" w:color="B8B0A0" w:sz="4"/>
+            </w:tcBorders>
+            <w:tcMar>
+              <w:top w:type="dxa" w:w="60"/>
+              <w:left w:type="dxa" w:w="100"/>
+              <w:bottom w:type="dxa" w:w="60"/>
+              <w:right w:type="dxa" w:w="100"/>
+            </w:tcMar>
+          </w:tcPr>
+          <w:p>
+            <w:r>
+              <w:rPr>
+                <w:sz w:val="19"/>
+                <w:szCs w:val="19"/>
+              </w:rPr>
+              <w:t xml:space="preserve">a los pocos días</w:t>
+            </w:r>
+          </w:p>
+        </w:tc>
+        <w:tc>
+          <w:tcPr>
+            <w:tcW w:type="dxa" w:w="2777"/>
+            <w:tcBorders>
+              <w:top w:val="single" w:color="B8B0A0" w:sz="4"/>
+              <w:left w:val="single" w:color="B8B0A0" w:sz="4"/>
+              <w:bottom w:val="single" w:color="B8B0A0" w:sz="4"/>
+              <w:right w:val="single" w:color="B8B0A0" w:sz="4"/>
+            </w:tcBorders>
+            <w:tcMar>
+              <w:top w:type="dxa" w:w="60"/>
+              <w:left w:type="dxa" w:w="100"/>
+              <w:bottom w:type="dxa" w:w="60"/>
+              <w:right w:type="dxa" w:w="100"/>
+            </w:tcMar>
+          </w:tcPr>
+          <w:p>
+            <w:r>
+              <w:rPr>
+                <w:sz w:val="19"/>
+                <w:szCs w:val="19"/>
+              </w:rPr>
+              <w:t xml:space="preserve">1 día</w:t>
+            </w:r>
+          </w:p>
+        </w:tc>
+      </w:tr>
+      <w:tr>
+        <w:tc>
+          <w:tcPr>
+            <w:tcW w:type="dxa" w:w="3472"/>
+            <w:tcBorders>
+              <w:top w:val="single" w:color="B8B0A0" w:sz="4"/>
+              <w:left w:val="single" w:color="B8B0A0" w:sz="4"/>
+              <w:bottom w:val="single" w:color="B8B0A0" w:sz="4"/>
+              <w:right w:val="single" w:color="B8B0A0" w:sz="4"/>
+            </w:tcBorders>
+            <w:tcMar>
+              <w:top w:type="dxa" w:w="60"/>
+              <w:left w:type="dxa" w:w="100"/>
+              <w:bottom w:type="dxa" w:w="60"/>
+              <w:right w:type="dxa" w:w="100"/>
+            </w:tcMar>
+          </w:tcPr>
+          <w:p>
+            <w:r>
+              <w:rPr>
+                <w:sz w:val="19"/>
+                <w:szCs w:val="19"/>
+              </w:rPr>
+              <w:t xml:space="preserve">El broche (antes del picnic)</w:t>
+            </w:r>
+          </w:p>
+        </w:tc>
+        <w:tc>
+          <w:tcPr>
+            <w:tcW w:type="dxa" w:w="2777"/>
+            <w:tcBorders>
+              <w:top w:val="single" w:color="B8B0A0" w:sz="4"/>
+              <w:left w:val="single" w:color="B8B0A0" w:sz="4"/>
+              <w:bottom w:val="single" w:color="B8B0A0" w:sz="4"/>
+              <w:right w:val="single" w:color="B8B0A0" w:sz="4"/>
+            </w:tcBorders>
+            <w:tcMar>
+              <w:top w:type="dxa" w:w="60"/>
+              <w:left w:type="dxa" w:w="100"/>
+              <w:bottom w:type="dxa" w:w="60"/>
+              <w:right w:type="dxa" w:w="100"/>
+            </w:tcMar>
+          </w:tcPr>
+          <w:p>
+            <w:r>
+              <w:rPr>
+                <w:sz w:val="19"/>
+                <w:szCs w:val="19"/>
+              </w:rPr>
+              <w:t xml:space="preserve">un mes después de conocerse</w:t>
+            </w:r>
+          </w:p>
+        </w:tc>
+        <w:tc>
+          <w:tcPr>
+            <w:tcW w:type="dxa" w:w="2777"/>
+            <w:tcBorders>
+              <w:top w:val="single" w:color="B8B0A0" w:sz="4"/>
+              <w:left w:val="single" w:color="B8B0A0" w:sz="4"/>
+              <w:bottom w:val="single" w:color="B8B0A0" w:sz="4"/>
+              <w:right w:val="single" w:color="B8B0A0" w:sz="4"/>
+            </w:tcBorders>
+            <w:tcMar>
+              <w:top w:type="dxa" w:w="60"/>
+              <w:left w:type="dxa" w:w="100"/>
+              <w:bottom w:type="dxa" w:w="60"/>
+              <w:right w:type="dxa" w:w="100"/>
+            </w:tcMar>
+          </w:tcPr>
+          <w:p>
+            <w:r>
+              <w:rPr>
+                <w:sz w:val="19"/>
+                <w:szCs w:val="19"/>
+              </w:rPr>
+              <w:t xml:space="preserve">5 días de amigas</w:t>
+            </w:r>
+          </w:p>
+        </w:tc>
+      </w:tr>
+      <w:tr>
+        <w:tc>
+          <w:tcPr>
+            <w:tcW w:type="dxa" w:w="3472"/>
+            <w:tcBorders>
+              <w:top w:val="single" w:color="B8B0A0" w:sz="4"/>
+              <w:left w:val="single" w:color="B8B0A0" w:sz="4"/>
+              <w:bottom w:val="single" w:color="B8B0A0" w:sz="4"/>
+              <w:right w:val="single" w:color="B8B0A0" w:sz="4"/>
+            </w:tcBorders>
+            <w:tcMar>
+              <w:top w:type="dxa" w:w="60"/>
+              <w:left w:type="dxa" w:w="100"/>
+              <w:bottom w:type="dxa" w:w="60"/>
+              <w:right w:type="dxa" w:w="100"/>
+            </w:tcMar>
+          </w:tcPr>
+          <w:p>
+            <w:r>
+              <w:rPr>
+                <w:sz w:val="19"/>
+                <w:szCs w:val="19"/>
+              </w:rPr>
+              <w:t xml:space="preserve">Invitar a Diana al té</w:t>
+            </w:r>
+          </w:p>
+        </w:tc>
+        <w:tc>
+          <w:tcPr>
+            <w:tcW w:type="dxa" w:w="2777"/>
+            <w:tcBorders>
+              <w:top w:val="single" w:color="B8B0A0" w:sz="4"/>
+              <w:left w:val="single" w:color="B8B0A0" w:sz="4"/>
+              <w:bottom w:val="single" w:color="B8B0A0" w:sz="4"/>
+              <w:right w:val="single" w:color="B8B0A0" w:sz="4"/>
+            </w:tcBorders>
+            <w:tcMar>
+              <w:top w:type="dxa" w:w="60"/>
+              <w:left w:type="dxa" w:w="100"/>
+              <w:bottom w:type="dxa" w:w="60"/>
+              <w:right w:type="dxa" w:w="100"/>
+            </w:tcMar>
+          </w:tcPr>
+          <w:p>
+            <w:r>
+              <w:rPr>
+                <w:sz w:val="19"/>
+                <w:szCs w:val="19"/>
+              </w:rPr>
+              <w:t xml:space="preserve">unos tres meses después</w:t>
+            </w:r>
+          </w:p>
+        </w:tc>
+        <w:tc>
+          <w:tcPr>
+            <w:tcW w:type="dxa" w:w="2777"/>
+            <w:tcBorders>
+              <w:top w:val="single" w:color="B8B0A0" w:sz="4"/>
+              <w:left w:val="single" w:color="B8B0A0" w:sz="4"/>
+              <w:bottom w:val="single" w:color="B8B0A0" w:sz="4"/>
+              <w:right w:val="single" w:color="B8B0A0" w:sz="4"/>
+            </w:tcBorders>
+            <w:tcMar>
+              <w:top w:type="dxa" w:w="60"/>
+              <w:left w:type="dxa" w:w="100"/>
+              <w:bottom w:type="dxa" w:w="60"/>
+              <w:right w:type="dxa" w:w="100"/>
+            </w:tcMar>
+          </w:tcPr>
+          <w:p>
+            <w:r>
+              <w:rPr>
+                <w:sz w:val="19"/>
+                <w:szCs w:val="19"/>
+              </w:rPr>
+              <w:t xml:space="preserve">10 días de amigas</w:t>
+            </w:r>
+          </w:p>
+        </w:tc>
+      </w:tr>
+      <w:tr>
+        <w:tc>
+          <w:tcPr>
+            <w:tcW w:type="dxa" w:w="3472"/>
+            <w:tcBorders>
+              <w:top w:val="single" w:color="B8B0A0" w:sz="4"/>
+              <w:left w:val="single" w:color="B8B0A0" w:sz="4"/>
+              <w:bottom w:val="single" w:color="B8B0A0" w:sz="4"/>
+              <w:right w:val="single" w:color="B8B0A0" w:sz="4"/>
+            </w:tcBorders>
+            <w:tcMar>
+              <w:top w:type="dxa" w:w="60"/>
+              <w:left w:type="dxa" w:w="100"/>
+              <w:bottom w:type="dxa" w:w="60"/>
+              <w:right w:type="dxa" w:w="100"/>
+            </w:tcMar>
+          </w:tcPr>
+          <w:p>
+            <w:r>
+              <w:rPr>
+                <w:sz w:val="19"/>
+                <w:szCs w:val="19"/>
+              </w:rPr>
+              <w:t xml:space="preserve">La prohibición</w:t>
+            </w:r>
+          </w:p>
+        </w:tc>
+        <w:tc>
+          <w:tcPr>
+            <w:tcW w:type="dxa" w:w="2777"/>
+            <w:tcBorders>
+              <w:top w:val="single" w:color="B8B0A0" w:sz="4"/>
+              <w:left w:val="single" w:color="B8B0A0" w:sz="4"/>
+              <w:bottom w:val="single" w:color="B8B0A0" w:sz="4"/>
+              <w:right w:val="single" w:color="B8B0A0" w:sz="4"/>
+            </w:tcBorders>
+            <w:tcMar>
+              <w:top w:type="dxa" w:w="60"/>
+              <w:left w:type="dxa" w:w="100"/>
+              <w:bottom w:type="dxa" w:w="60"/>
+              <w:right w:type="dxa" w:w="100"/>
+            </w:tcMar>
+          </w:tcPr>
+          <w:p>
+            <w:r>
+              <w:rPr>
+                <w:sz w:val="19"/>
+                <w:szCs w:val="19"/>
+              </w:rPr>
+              <w:t xml:space="preserve">al día siguiente del vino</w:t>
+            </w:r>
+          </w:p>
+        </w:tc>
+        <w:tc>
+          <w:tcPr>
+            <w:tcW w:type="dxa" w:w="2777"/>
+            <w:tcBorders>
+              <w:top w:val="single" w:color="B8B0A0" w:sz="4"/>
+              <w:left w:val="single" w:color="B8B0A0" w:sz="4"/>
+              <w:bottom w:val="single" w:color="B8B0A0" w:sz="4"/>
+              <w:right w:val="single" w:color="B8B0A0" w:sz="4"/>
+            </w:tcBorders>
+            <w:tcMar>
+              <w:top w:type="dxa" w:w="60"/>
+              <w:left w:type="dxa" w:w="100"/>
+              <w:bottom w:type="dxa" w:w="60"/>
+              <w:right w:type="dxa" w:w="100"/>
+            </w:tcMar>
+          </w:tcPr>
+          <w:p>
+            <w:r>
+              <w:rPr>
+                <w:sz w:val="19"/>
+                <w:szCs w:val="19"/>
+              </w:rPr>
+              <w:t xml:space="preserve">1 día</w:t>
+            </w:r>
+          </w:p>
+        </w:tc>
+      </w:tr>
+      <w:tr>
+        <w:tc>
+          <w:tcPr>
+            <w:tcW w:type="dxa" w:w="3472"/>
+            <w:tcBorders>
+              <w:top w:val="single" w:color="B8B0A0" w:sz="4"/>
+              <w:left w:val="single" w:color="B8B0A0" w:sz="4"/>
+              <w:bottom w:val="single" w:color="B8B0A0" w:sz="4"/>
+              <w:right w:val="single" w:color="B8B0A0" w:sz="4"/>
+            </w:tcBorders>
+            <w:tcMar>
+              <w:top w:type="dxa" w:w="60"/>
+              <w:left w:type="dxa" w:w="100"/>
+              <w:bottom w:type="dxa" w:w="60"/>
+              <w:right w:type="dxa" w:w="100"/>
+            </w:tcMar>
+          </w:tcPr>
+          <w:p>
+            <w:r>
+              <w:rPr>
+                <w:sz w:val="19"/>
+                <w:szCs w:val="19"/>
+              </w:rPr>
+              <w:t xml:space="preserve">El crup</w:t>
+            </w:r>
+          </w:p>
+        </w:tc>
+        <w:tc>
+          <w:tcPr>
+            <w:tcW w:type="dxa" w:w="2777"/>
+            <w:tcBorders>
+              <w:top w:val="single" w:color="B8B0A0" w:sz="4"/>
+              <w:left w:val="single" w:color="B8B0A0" w:sz="4"/>
+              <w:bottom w:val="single" w:color="B8B0A0" w:sz="4"/>
+              <w:right w:val="single" w:color="B8B0A0" w:sz="4"/>
+            </w:tcBorders>
+            <w:tcMar>
+              <w:top w:type="dxa" w:w="60"/>
+              <w:left w:type="dxa" w:w="100"/>
+              <w:bottom w:type="dxa" w:w="60"/>
+              <w:right w:type="dxa" w:w="100"/>
+            </w:tcMar>
+          </w:tcPr>
+          <w:p>
+            <w:r>
+              <w:rPr>
+                <w:sz w:val="19"/>
+                <w:szCs w:val="19"/>
+              </w:rPr>
+              <w:t xml:space="preserve">unos tres meses después</w:t>
+            </w:r>
+          </w:p>
+        </w:tc>
+        <w:tc>
+          <w:tcPr>
+            <w:tcW w:type="dxa" w:w="2777"/>
+            <w:tcBorders>
+              <w:top w:val="single" w:color="B8B0A0" w:sz="4"/>
+              <w:left w:val="single" w:color="B8B0A0" w:sz="4"/>
+              <w:bottom w:val="single" w:color="B8B0A0" w:sz="4"/>
+              <w:right w:val="single" w:color="B8B0A0" w:sz="4"/>
+            </w:tcBorders>
+            <w:tcMar>
+              <w:top w:type="dxa" w:w="60"/>
+              <w:left w:type="dxa" w:w="100"/>
+              <w:bottom w:type="dxa" w:w="60"/>
+              <w:right w:type="dxa" w:w="100"/>
+            </w:tcMar>
+          </w:tcPr>
+          <w:p>
+            <w:r>
+              <w:rPr>
+                <w:sz w:val="19"/>
+                <w:szCs w:val="19"/>
+              </w:rPr>
+              <w:t xml:space="preserve">12 días después de la prohibición</w:t>
+            </w:r>
+          </w:p>
+        </w:tc>
+      </w:tr>
+      <w:tr>
+        <w:tc>
+          <w:tcPr>
+            <w:tcW w:type="dxa" w:w="3472"/>
+            <w:tcBorders>
+              <w:top w:val="single" w:color="B8B0A0" w:sz="4"/>
+              <w:left w:val="single" w:color="B8B0A0" w:sz="4"/>
+              <w:bottom w:val="single" w:color="B8B0A0" w:sz="4"/>
+              <w:right w:val="single" w:color="B8B0A0" w:sz="4"/>
+            </w:tcBorders>
+            <w:tcMar>
+              <w:top w:type="dxa" w:w="60"/>
+              <w:left w:type="dxa" w:w="100"/>
+              <w:bottom w:type="dxa" w:w="60"/>
+              <w:right w:type="dxa" w:w="100"/>
+            </w:tcMar>
+          </w:tcPr>
+          <w:p>
+            <w:r>
+              <w:rPr>
+                <w:sz w:val="19"/>
+                <w:szCs w:val="19"/>
+              </w:rPr>
+              <w:t xml:space="preserve">La tía Josephine</w:t>
+            </w:r>
+          </w:p>
+        </w:tc>
+        <w:tc>
+          <w:tcPr>
+            <w:tcW w:type="dxa" w:w="2777"/>
+            <w:tcBorders>
+              <w:top w:val="single" w:color="B8B0A0" w:sz="4"/>
+              <w:left w:val="single" w:color="B8B0A0" w:sz="4"/>
+              <w:bottom w:val="single" w:color="B8B0A0" w:sz="4"/>
+              <w:right w:val="single" w:color="B8B0A0" w:sz="4"/>
+            </w:tcBorders>
+            <w:tcMar>
+              <w:top w:type="dxa" w:w="60"/>
+              <w:left w:type="dxa" w:w="100"/>
+              <w:bottom w:type="dxa" w:w="60"/>
+              <w:right w:type="dxa" w:w="100"/>
+            </w:tcMar>
+          </w:tcPr>
+          <w:p>
+            <w:r>
+              <w:rPr>
+                <w:sz w:val="19"/>
+                <w:szCs w:val="19"/>
+              </w:rPr>
+              <w:t xml:space="preserve">unos ocho meses después de conocerse</w:t>
+            </w:r>
+          </w:p>
+        </w:tc>
+        <w:tc>
+          <w:tcPr>
+            <w:tcW w:type="dxa" w:w="2777"/>
+            <w:tcBorders>
+              <w:top w:val="single" w:color="B8B0A0" w:sz="4"/>
+              <w:left w:val="single" w:color="B8B0A0" w:sz="4"/>
+              <w:bottom w:val="single" w:color="B8B0A0" w:sz="4"/>
+              <w:right w:val="single" w:color="B8B0A0" w:sz="4"/>
+            </w:tcBorders>
+            <w:tcMar>
+              <w:top w:type="dxa" w:w="60"/>
+              <w:left w:type="dxa" w:w="100"/>
+              <w:bottom w:type="dxa" w:w="60"/>
+              <w:right w:type="dxa" w:w="100"/>
+            </w:tcMar>
+          </w:tcPr>
+          <w:p>
+            <w:r>
+              <w:rPr>
+                <w:sz w:val="19"/>
+                <w:szCs w:val="19"/>
+              </w:rPr>
+              <w:t xml:space="preserve">25 días de amigas</w:t>
+            </w:r>
+          </w:p>
+        </w:tc>
+      </w:tr>
+      <w:tr>
+        <w:tc>
+          <w:tcPr>
+            <w:tcW w:type="dxa" w:w="3472"/>
+            <w:tcBorders>
+              <w:top w:val="single" w:color="B8B0A0" w:sz="4"/>
+              <w:left w:val="single" w:color="B8B0A0" w:sz="4"/>
+              <w:bottom w:val="single" w:color="B8B0A0" w:sz="4"/>
+              <w:right w:val="single" w:color="B8B0A0" w:sz="4"/>
+            </w:tcBorders>
+            <w:tcMar>
+              <w:top w:type="dxa" w:w="60"/>
+              <w:left w:type="dxa" w:w="100"/>
+              <w:bottom w:type="dxa" w:w="60"/>
+              <w:right w:type="dxa" w:w="100"/>
+            </w:tcMar>
+          </w:tcPr>
+          <w:p>
+            <w:r>
+              <w:rPr>
+                <w:sz w:val="19"/>
+                <w:szCs w:val="19"/>
+              </w:rPr>
+              <w:t xml:space="preserve">Hacer las paces con Gilbert</w:t>
+            </w:r>
+          </w:p>
+        </w:tc>
+        <w:tc>
+          <w:tcPr>
+            <w:tcW w:type="dxa" w:w="2777"/>
+            <w:tcBorders>
+              <w:top w:val="single" w:color="B8B0A0" w:sz="4"/>
+              <w:left w:val="single" w:color="B8B0A0" w:sz="4"/>
+              <w:bottom w:val="single" w:color="B8B0A0" w:sz="4"/>
+              <w:right w:val="single" w:color="B8B0A0" w:sz="4"/>
+            </w:tcBorders>
+            <w:tcMar>
+              <w:top w:type="dxa" w:w="60"/>
+              <w:left w:type="dxa" w:w="100"/>
+              <w:bottom w:type="dxa" w:w="60"/>
+              <w:right w:type="dxa" w:w="100"/>
+            </w:tcMar>
+          </w:tcPr>
+          <w:p>
+            <w:r>
+              <w:rPr>
+                <w:sz w:val="19"/>
+                <w:szCs w:val="19"/>
+              </w:rPr>
+              <w:t xml:space="preserve">años</w:t>
+            </w:r>
+          </w:p>
+        </w:tc>
+        <w:tc>
+          <w:tcPr>
+            <w:tcW w:type="dxa" w:w="2777"/>
+            <w:tcBorders>
+              <w:top w:val="single" w:color="B8B0A0" w:sz="4"/>
+              <w:left w:val="single" w:color="B8B0A0" w:sz="4"/>
+              <w:bottom w:val="single" w:color="B8B0A0" w:sz="4"/>
+              <w:right w:val="single" w:color="B8B0A0" w:sz="4"/>
+            </w:tcBorders>
+            <w:tcMar>
+              <w:top w:type="dxa" w:w="60"/>
+              <w:left w:type="dxa" w:w="100"/>
+              <w:bottom w:type="dxa" w:w="60"/>
+              <w:right w:type="dxa" w:w="100"/>
+            </w:tcMar>
+          </w:tcPr>
+          <w:p>
+            <w:r>
+              <w:rPr>
+                <w:sz w:val="19"/>
+                <w:szCs w:val="19"/>
+              </w:rPr>
+              <w:t xml:space="preserve">28 días después de «¡Zanahorias!»</w:t>
+            </w:r>
+          </w:p>
+        </w:tc>
+      </w:tr>
+      <w:tr>
+        <w:tc>
+          <w:tcPr>
+            <w:tcW w:type="dxa" w:w="3472"/>
+            <w:tcBorders>
+              <w:top w:val="single" w:color="B8B0A0" w:sz="4"/>
+              <w:left w:val="single" w:color="B8B0A0" w:sz="4"/>
+              <w:bottom w:val="single" w:color="B8B0A0" w:sz="4"/>
+              <w:right w:val="single" w:color="B8B0A0" w:sz="4"/>
+            </w:tcBorders>
+            <w:tcMar>
+              <w:top w:type="dxa" w:w="60"/>
+              <w:left w:type="dxa" w:w="100"/>
+              <w:bottom w:type="dxa" w:w="60"/>
+              <w:right w:type="dxa" w:w="100"/>
+            </w:tcMar>
+          </w:tcPr>
+          <w:p>
+            <w:r>
+              <w:rPr>
+                <w:sz w:val="19"/>
+                <w:szCs w:val="19"/>
+              </w:rPr>
+              <w:t xml:space="preserve">Marilla invita a los Allan</w:t>
+            </w:r>
+          </w:p>
+        </w:tc>
+        <w:tc>
+          <w:tcPr>
+            <w:tcW w:type="dxa" w:w="2777"/>
+            <w:tcBorders>
+              <w:top w:val="single" w:color="B8B0A0" w:sz="4"/>
+              <w:left w:val="single" w:color="B8B0A0" w:sz="4"/>
+              <w:bottom w:val="single" w:color="B8B0A0" w:sz="4"/>
+              <w:right w:val="single" w:color="B8B0A0" w:sz="4"/>
+            </w:tcBorders>
+            <w:tcMar>
+              <w:top w:type="dxa" w:w="60"/>
+              <w:left w:type="dxa" w:w="100"/>
+              <w:bottom w:type="dxa" w:w="60"/>
+              <w:right w:type="dxa" w:w="100"/>
+            </w:tcMar>
+          </w:tcPr>
+          <w:p>
+            <w:r>
+              <w:rPr>
+                <w:sz w:val="19"/>
+                <w:szCs w:val="19"/>
+              </w:rPr>
+              <w:t xml:space="preserve">cuando llegan, mucho después</w:t>
+            </w:r>
+          </w:p>
+        </w:tc>
+        <w:tc>
+          <w:tcPr>
+            <w:tcW w:type="dxa" w:w="2777"/>
+            <w:tcBorders>
+              <w:top w:val="single" w:color="B8B0A0" w:sz="4"/>
+              <w:left w:val="single" w:color="B8B0A0" w:sz="4"/>
+              <w:bottom w:val="single" w:color="B8B0A0" w:sz="4"/>
+              <w:right w:val="single" w:color="B8B0A0" w:sz="4"/>
+            </w:tcBorders>
+            <w:tcMar>
+              <w:top w:type="dxa" w:w="60"/>
+              <w:left w:type="dxa" w:w="100"/>
+              <w:bottom w:type="dxa" w:w="60"/>
+              <w:right w:type="dxa" w:w="100"/>
+            </w:tcMar>
+          </w:tcPr>
+          <w:p>
+            <w:r>
+              <w:rPr>
+                <w:sz w:val="19"/>
+                <w:szCs w:val="19"/>
+              </w:rPr>
+              <w:t xml:space="preserve">14 días después de la primera escuela dominical</w:t>
+            </w:r>
+          </w:p>
+        </w:tc>
+      </w:tr>
+      <w:tr>
+        <w:tc>
+          <w:tcPr>
+            <w:tcW w:type="dxa" w:w="3472"/>
+            <w:tcBorders>
+              <w:top w:val="single" w:color="B8B0A0" w:sz="4"/>
+              <w:left w:val="single" w:color="B8B0A0" w:sz="4"/>
+              <w:bottom w:val="single" w:color="B8B0A0" w:sz="4"/>
+              <w:right w:val="single" w:color="B8B0A0" w:sz="4"/>
+            </w:tcBorders>
+            <w:tcMar>
+              <w:top w:type="dxa" w:w="60"/>
+              <w:left w:type="dxa" w:w="100"/>
+              <w:bottom w:type="dxa" w:w="60"/>
+              <w:right w:type="dxa" w:w="100"/>
+            </w:tcMar>
+          </w:tcPr>
+          <w:p>
+            <w:r>
+              <w:rPr>
+                <w:sz w:val="19"/>
+                <w:szCs w:val="19"/>
+              </w:rPr>
+              <w:t xml:space="preserve">El pastel con linimento</w:t>
+            </w:r>
+          </w:p>
+        </w:tc>
+        <w:tc>
+          <w:tcPr>
+            <w:tcW w:type="dxa" w:w="2777"/>
+            <w:tcBorders>
+              <w:top w:val="single" w:color="B8B0A0" w:sz="4"/>
+              <w:left w:val="single" w:color="B8B0A0" w:sz="4"/>
+              <w:bottom w:val="single" w:color="B8B0A0" w:sz="4"/>
+              <w:right w:val="single" w:color="B8B0A0" w:sz="4"/>
+            </w:tcBorders>
+            <w:tcMar>
+              <w:top w:type="dxa" w:w="60"/>
+              <w:left w:type="dxa" w:w="100"/>
+              <w:bottom w:type="dxa" w:w="60"/>
+              <w:right w:type="dxa" w:w="100"/>
+            </w:tcMar>
+          </w:tcPr>
+          <w:p>
+            <w:r>
+              <w:rPr>
+                <w:sz w:val="19"/>
+                <w:szCs w:val="19"/>
+              </w:rPr>
+              <w:t xml:space="preserve">unos días después</w:t>
+            </w:r>
+          </w:p>
+        </w:tc>
+        <w:tc>
+          <w:tcPr>
+            <w:tcW w:type="dxa" w:w="2777"/>
+            <w:tcBorders>
+              <w:top w:val="single" w:color="B8B0A0" w:sz="4"/>
+              <w:left w:val="single" w:color="B8B0A0" w:sz="4"/>
+              <w:bottom w:val="single" w:color="B8B0A0" w:sz="4"/>
+              <w:right w:val="single" w:color="B8B0A0" w:sz="4"/>
+            </w:tcBorders>
+            <w:tcMar>
+              <w:top w:type="dxa" w:w="60"/>
+              <w:left w:type="dxa" w:w="100"/>
+              <w:bottom w:type="dxa" w:w="60"/>
+              <w:right w:type="dxa" w:w="100"/>
+            </w:tcMar>
+          </w:tcPr>
+          <w:p>
+            <w:r>
+              <w:rPr>
+                <w:sz w:val="19"/>
+                <w:szCs w:val="19"/>
+              </w:rPr>
+              <w:t xml:space="preserve">3 días</w:t>
+            </w:r>
+          </w:p>
+        </w:tc>
+      </w:tr>
+      <w:tr>
+        <w:tc>
+          <w:tcPr>
+            <w:tcW w:type="dxa" w:w="3472"/>
+            <w:tcBorders>
+              <w:top w:val="single" w:color="B8B0A0" w:sz="4"/>
+              <w:left w:val="single" w:color="B8B0A0" w:sz="4"/>
+              <w:bottom w:val="single" w:color="B8B0A0" w:sz="4"/>
+              <w:right w:val="single" w:color="B8B0A0" w:sz="4"/>
+            </w:tcBorders>
+            <w:tcMar>
+              <w:top w:type="dxa" w:w="60"/>
+              <w:left w:type="dxa" w:w="100"/>
+              <w:bottom w:type="dxa" w:w="60"/>
+              <w:right w:type="dxa" w:w="100"/>
+            </w:tcMar>
+          </w:tcPr>
+          <w:p>
+            <w:r>
+              <w:rPr>
+                <w:sz w:val="19"/>
+                <w:szCs w:val="19"/>
+              </w:rPr>
+              <w:t xml:space="preserve">El examen de Queen's</w:t>
+            </w:r>
+          </w:p>
+        </w:tc>
+        <w:tc>
+          <w:tcPr>
+            <w:tcW w:type="dxa" w:w="2777"/>
+            <w:tcBorders>
+              <w:top w:val="single" w:color="B8B0A0" w:sz="4"/>
+              <w:left w:val="single" w:color="B8B0A0" w:sz="4"/>
+              <w:bottom w:val="single" w:color="B8B0A0" w:sz="4"/>
+              <w:right w:val="single" w:color="B8B0A0" w:sz="4"/>
+            </w:tcBorders>
+            <w:tcMar>
+              <w:top w:type="dxa" w:w="60"/>
+              <w:left w:type="dxa" w:w="100"/>
+              <w:bottom w:type="dxa" w:w="60"/>
+              <w:right w:type="dxa" w:w="100"/>
+            </w:tcMar>
+          </w:tcPr>
+          <w:p>
+            <w:r>
+              <w:rPr>
+                <w:sz w:val="19"/>
+                <w:szCs w:val="19"/>
+              </w:rPr>
+              <w:t xml:space="preserve">unos tres años después</w:t>
+            </w:r>
+          </w:p>
+        </w:tc>
+        <w:tc>
+          <w:tcPr>
+            <w:tcW w:type="dxa" w:w="2777"/>
+            <w:tcBorders>
+              <w:top w:val="single" w:color="B8B0A0" w:sz="4"/>
+              <w:left w:val="single" w:color="B8B0A0" w:sz="4"/>
+              <w:bottom w:val="single" w:color="B8B0A0" w:sz="4"/>
+              <w:right w:val="single" w:color="B8B0A0" w:sz="4"/>
+            </w:tcBorders>
+            <w:tcMar>
+              <w:top w:type="dxa" w:w="60"/>
+              <w:left w:type="dxa" w:w="100"/>
+              <w:bottom w:type="dxa" w:w="60"/>
+              <w:right w:type="dxa" w:w="100"/>
+            </w:tcMar>
+          </w:tcPr>
+          <w:p>
+            <w:r>
+              <w:rPr>
+                <w:sz w:val="19"/>
+                <w:szCs w:val="19"/>
+              </w:rPr>
+              <w:t xml:space="preserve">desde el segundo verano</w:t>
+            </w:r>
+          </w:p>
+        </w:tc>
+      </w:tr>
+    </w:tbl>
     <w:p>
       <w:pPr>
         <w:pStyle w:val="Heading1"/>
@@ -4585,7 +5521,7 @@
           <w:sz w:val="18"/>
           <w:szCs w:val="18"/>
         </w:rPr>
-        <w:t xml:space="preserve">hito 15: Matthew le regala un vestido con mangas abullonadas.</w:t>
+        <w:t xml:space="preserve">hito 40: Matthew le regala un vestido con mangas abullonadas.</w:t>
       </w:r>
     </w:p>
     <w:p>

</xml_diff>

<commit_message>
Puntos además de tiempo, y guiños en los diálogos
- Algunas cadenas piden puntos además de días: el té con Diana, que Diana la
  quiera 5; la tía Josephine, afecto 5 y 10 de letras; las paces con Gilbert,
  30 de estudio (y 28 días).
- Guiños: cada meta del cuaderno puede tener frases que alguien dice al pasar
  (guiño quien: …) mientras está abierta, o cerrada (guiño cerrada quien: …);
  como mucho dos por persona, primero las metas abiertas, luego las que solo
  piden esfuerzo o tiempo, rotando por día. 28 guiños escritos.
- Documentos y diagramas al día.

Co-Authored-By: Claude Opus 5.5 <noreply@anthropic.com>
Claude-Session: https://claude.ai/code/session_01VY3w9XmL1TrbHxLtQe81Lv
</commit_message>
<xml_diff>
--- a/docs/hitos-y-grafos.docx
+++ b/docs/hitos-y-grafos.docx
@@ -218,7 +218,17 @@
         <w:t xml:space="preserve">src/datos/cuaderno.txt</w:t>
       </w:r>
       <w:r>
-        <w:t xml:space="preserve">) no es parte del motor: lee el estado y le muestra al jugador las metas, con pistas, para que se guíe.</w:t>
+        <w:t xml:space="preserve">) no es parte del motor: lee el estado y le muestra al jugador las metas, con pistas, para que se guíe. Además pone </w:t>
+      </w:r>
+      <w:r>
+        <w:rPr>
+          <w:b/>
+          <w:bCs/>
+        </w:rPr>
+        <w:t xml:space="preserve">guiños</w:t>
+      </w:r>
+      <w:r>
+        <w:t xml:space="preserve"> en los diálogos: lo que alguien dice al pasar sobre una meta pendiente («Mamá nunca me deja ir a tomar el té a ninguna parte… ¡me encantaría que alguien me invitara!»), como mucho dos por persona a la vez.</w:t>
       </w:r>
     </w:p>
     <w:p>
@@ -2856,7 +2866,7 @@
                 <w:sz w:val="19"/>
                 <w:szCs w:val="19"/>
               </w:rPr>
-              <w:t xml:space="preserve">amigas hace 25 días, sin prohibición; escena grande (no el mismo día que otra)</w:t>
+              <w:t xml:space="preserve">amigas hace 15 días, Diana la quiere 5, Ana tiene 10 de letras, sin prohibición; escena grande</w:t>
             </w:r>
           </w:p>
         </w:tc>
@@ -4847,7 +4857,7 @@
                 <w:sz w:val="19"/>
                 <w:szCs w:val="19"/>
               </w:rPr>
-              <w:t xml:space="preserve">10 días de amigas</w:t>
+              <w:t xml:space="preserve">que Diana la quiera 5 (y 5 días)</w:t>
             </w:r>
           </w:p>
         </w:tc>
@@ -5087,7 +5097,7 @@
                 <w:sz w:val="19"/>
                 <w:szCs w:val="19"/>
               </w:rPr>
-              <w:t xml:space="preserve">25 días de amigas</w:t>
+              <w:t xml:space="preserve">Diana la quiere 5 y 10 de letras (y 15 días)</w:t>
             </w:r>
           </w:p>
         </w:tc>
@@ -5167,7 +5177,7 @@
                 <w:sz w:val="19"/>
                 <w:szCs w:val="19"/>
               </w:rPr>
-              <w:t xml:space="preserve">28 días después de «¡Zanahorias!»</w:t>
+              <w:t xml:space="preserve">30 de estudio (y 28 días después de «¡Zanahorias!»)</w:t>
             </w:r>
           </w:p>
         </w:tc>

</xml_diff>

<commit_message>
Conversaciones de Ana con los suyos, según la cercanía; el «adiós» del menú
- src/datos/conversaciones.txt: 39 conversaciones inspiradas en el libro con
  Marilla, Matthew, Diana, la Sra. Lynde, la Sra. Barry y el Sr. Harrison,
  largas y cortas, disponibles según el afecto (y el tiempo, para las más
  íntimas); las que marcan un paso suman afecto, otras una habilidad.
- Desde el menú de la persona (💬 Conversar: …), o a veces solas cuando Ana
  está cerca y libre; una por día con cada uno.
- El menú ya no cierra con «Adiós» (no es despedirse): «Nada por ahora»; el
  fin del paseo con Diana, según la hora.
- Condición hora:a-b; el revisor del grafo lee también las conversaciones.

Co-Authored-By: Claude Opus 5.5 <noreply@anthropic.com>
Claude-Session: https://claude.ai/code/session_01VY3w9XmL1TrbHxLtQe81Lv
</commit_message>
<xml_diff>
--- a/docs/hitos-y-grafos.docx
+++ b/docs/hitos-y-grafos.docx
@@ -172,6 +172,38 @@
       </w:r>
       <w:r>
         <w:t xml:space="preserve"> (dejan hechos, suman a cualidades, le encargan una meta a alguien). Las rutinas son escenas que se repiten.</w:t>
+      </w:r>
+    </w:p>
+    <w:p>
+      <w:pPr>
+        <w:pStyle w:val="ListParagraph"/>
+        <w:numPr>
+          <w:ilvl w:val="0"/>
+          <w:numId w:val="2"/>
+        </w:numPr>
+        <w:spacing w:after="60"/>
+      </w:pPr>
+      <w:r>
+        <w:rPr>
+          <w:b/>
+          <w:bCs/>
+        </w:rPr>
+        <w:t xml:space="preserve">Las conversaciones</w:t>
+      </w:r>
+      <w:r>
+        <w:t xml:space="preserve"> (</w:t>
+      </w:r>
+      <w:r>
+        <w:rPr>
+          <w:rFonts w:ascii="Consolas" w:cs="Consolas" w:eastAsia="Consolas" w:hAnsi="Consolas"/>
+          <w:color w:val="7A4A1A"/>
+          <w:sz w:val="19"/>
+          <w:szCs w:val="19"/>
+        </w:rPr>
+        <w:t xml:space="preserve">src/datos/conversaciones.txt</w:t>
+      </w:r>
+      <w:r>
+        <w:t xml:space="preserve">): escenas de Ana con los suyos, inspiradas en el libro, disponibles según la cercanía (el afecto). Se tienen desde el menú de la persona (💬 Conversar) o a veces solas; una por día con cada uno; las que marcan un paso suman afecto, otras una habilidad.</w:t>
       </w:r>
     </w:p>
     <w:p>

</xml_diff>

<commit_message>
El comienzo: el juego empieza la noche en que Ana llega, a prueba (cap. 3 a 8)
- Una partida nueva empieza en la cocina de Tejas Verdes al atardecer:
  «¿Dónde está el niño?», «llámeme Cordelia»; al otro día, el desayuno y el
  viaje a White Sands (la Sra. Blewett); Ana vuelve a prueba.
- Para quedarse: quehaceres, oraciones, que Marilla la quiera 3 (empieza en
  1; Matthew en 4) y 3 días → la escena se_queda. Meta «Quedarse en Tejas
  Verdes» en el cuaderno, con pistas y guiños de Matthew.
- Conocer a Diana espera a que Ana se quede; el capítulo 1 sigue con este
  comienzo; las partidas de antes y las pruebas parten con Ana ya quedándose.

Co-Authored-By: Claude Opus 5.5 <noreply@anthropic.com>
Claude-Session: https://claude.ai/code/session_01VY3w9XmL1TrbHxLtQe81Lv
</commit_message>
<xml_diff>
--- a/docs/hitos-y-grafos.docx
+++ b/docs/hitos-y-grafos.docx
@@ -1067,6 +1067,42 @@
       </w:pPr>
       <w:r>
         <w:t xml:space="preserve">2. Las cadenas del libro, como grafo</w:t>
+      </w:r>
+    </w:p>
+    <w:p>
+      <w:pPr>
+        <w:pStyle w:val="Heading2"/>
+      </w:pPr>
+      <w:r>
+        <w:t xml:space="preserve">El comienzo: Ana, a prueba</w:t>
+      </w:r>
+    </w:p>
+    <w:p>
+      <w:pPr>
+        <w:spacing w:after="120"/>
+      </w:pPr>
+      <w:r>
+        <w:t xml:space="preserve">Una partida nueva empieza </w:t>
+      </w:r>
+      <w:r>
+        <w:rPr>
+          <w:b/>
+          <w:bCs/>
+        </w:rPr>
+        <w:t xml:space="preserve">la noche en que Ana llega a Tejas Verdes</w:t>
+      </w:r>
+      <w:r>
+        <w:t xml:space="preserve"> (cap. 3 a 8). Marilla esperaba un niño: «¿Dónde está el niño?». Ana se queda esa noche; a la mañana siguiente, Marilla anuncia que irán donde la Sra. Spencer a arreglar el error; esa tarde, en White Sands, la Sra. Blewett quiere a Ana de sirvienta y Marilla no se la da: Ana vuelve </w:t>
+      </w:r>
+      <w:r>
+        <w:rPr>
+          <w:b/>
+          <w:bCs/>
+        </w:rPr>
+        <w:t xml:space="preserve">a prueba</w:t>
+      </w:r>
+      <w:r>
+        <w:t xml:space="preserve">. Para quedarse para siempre tiene que ganarse a Marilla: ayudar con los quehaceres, decir sus oraciones, y que Marilla la quiera 3 (empieza en 1; Matthew, en 4). Hasta entonces, conocer a Diana espera.</w:t>
       </w:r>
     </w:p>
     <w:p>

</xml_diff>

<commit_message>
Escenas con alternativas (como Yarn Spinner): la visita de la Sra. Lynde y algunas conversaciones
- En las líneas de una escena, «-> opción» con sus propias líneas y efectos
  (con sangría; «! hecho x», «! suma …»); «->*», lo que Ana haría sola. La
  escena espera la elección: un menú para el jugador; si no está, Ana elige
  sola después de unos segundos.
- La visita de la Sra. Lynde (cap. 9, 10) mientras Ana está a prueba:
  estallar (y tener que pedirle perdón, a lo grande o con pocas palabras,
  antes de poder quedarse), contar hasta diez, o salir corriendo a llorar.
- Alternativas en las conversaciones de las mangas abullonadas y de Gilbert.
- Mientras la escena espera la elección, Ana no se va ni habla sola.

Co-Authored-By: Claude Opus 5.5 <noreply@anthropic.com>
Claude-Session: https://claude.ai/code/session_01VY3w9XmL1TrbHxLtQe81Lv
</commit_message>
<xml_diff>
--- a/docs/hitos-y-grafos.docx
+++ b/docs/hitos-y-grafos.docx
@@ -203,7 +203,7 @@
         <w:t xml:space="preserve">src/datos/conversaciones.txt</w:t>
       </w:r>
       <w:r>
-        <w:t xml:space="preserve">): escenas de Ana con los suyos, inspiradas en el libro, disponibles según la cercanía (el afecto). Se tienen desde el menú de la persona (💬 Conversar) o a veces solas; una por día con cada uno; las que marcan un paso suman afecto, otras una habilidad.</w:t>
+        <w:t xml:space="preserve">): escenas de Ana con los suyos, inspiradas en el libro, disponibles según la cercanía (el afecto). Se tienen desde el menú de la persona (💬 Conversar) o a veces solas, todas las que se quiera; las que marcan un paso suman afecto, otras una habilidad, pero cada cualidad sube como mucho una vez al día (lo demás se nota al día siguiente).</w:t>
       </w:r>
     </w:p>
     <w:p>
@@ -1067,6 +1067,32 @@
       </w:pPr>
       <w:r>
         <w:t xml:space="preserve">2. Las cadenas del libro, como grafo</w:t>
+      </w:r>
+    </w:p>
+    <w:p>
+      <w:pPr>
+        <w:pStyle w:val="Heading2"/>
+      </w:pPr>
+      <w:r>
+        <w:t xml:space="preserve">Escenas con alternativas</w:t>
+      </w:r>
+    </w:p>
+    <w:p>
+      <w:pPr>
+        <w:spacing w:after="120"/>
+      </w:pPr>
+      <w:r>
+        <w:t xml:space="preserve">Todas son escenas; lo que cambia es qué las dispara. Algunas tienen </w:t>
+      </w:r>
+      <w:r>
+        <w:rPr>
+          <w:b/>
+          <w:bCs/>
+        </w:rPr>
+        <w:t xml:space="preserve">alternativas</w:t>
+      </w:r>
+      <w:r>
+        <w:t xml:space="preserve">, como en Yarn Spinner o en los eventos de Stardew Valley: la escena se detiene, el jugador elige qué hace Ana, y cada opción tiene sus propias líneas y efectos. Por ejemplo, cuando la Sra. Lynde dice que Ana es flaca, fea y pelirroja: «¡La odio!» (como en el libro: hay que ir a pedirle perdón, a lo grande o con pocas palabras), contar hasta diez, o salir corriendo a llorar. Si el jugador no está, Ana elige sola lo que haría ella.</w:t>
       </w:r>
     </w:p>
     <w:p>

</xml_diff>